<commit_message>
feat: resume and portfolio tweaks
</commit_message>
<xml_diff>
--- a/public/resume/Ali_Bayramli_Resume.docx
+++ b/public/resume/Ali_Bayramli_Resume.docx
@@ -158,7 +158,7 @@
               </w:rPr>
               <w:t xml:space="preserve"> </w:t>
             </w:r>
-            <w:hyperlink w:history="1" r:id="rIdsgd-lh1ifsry85qvurwoz">
+            <w:hyperlink w:history="1" r:id="rIdp14s4qczrpqptrctkhkq3">
               <w:r>
                 <w:rPr>
                   <w:rFonts w:ascii="Verdana" w:cs="Verdana" w:eastAsia="Verdana" w:hAnsi="Verdana"/>
@@ -221,7 +221,7 @@
               </w:rPr>
               <w:t xml:space="preserve"> </w:t>
             </w:r>
-            <w:hyperlink w:history="1" r:id="rIdih4hsxfbhlvblk5mwvjkl">
+            <w:hyperlink w:history="1" r:id="rIddqs3noc5kvco51qcop5hr">
               <w:r>
                 <w:rPr>
                   <w:rFonts w:ascii="Verdana" w:cs="Verdana" w:eastAsia="Verdana" w:hAnsi="Verdana"/>
@@ -266,7 +266,7 @@
                 <w:szCs w:val="22"/>
               </w:rPr>
             </w:pPr>
-            <w:hyperlink w:history="1" r:id="rIdukvbuj23zn5fnm5irxcop">
+            <w:hyperlink w:history="1" r:id="rIdvumrootdny3fsogbnnnck">
               <w:r>
                 <w:rPr>
                   <w:rFonts w:ascii="Verdana" w:cs="Verdana" w:eastAsia="Verdana" w:hAnsi="Verdana"/>
@@ -309,7 +309,7 @@
                 <w:szCs w:val="22"/>
               </w:rPr>
             </w:pPr>
-            <w:hyperlink w:history="1" r:id="rIducc4wgttjwotzsefg1mm8">
+            <w:hyperlink w:history="1" r:id="rIds53j0llu4zb6-ryrgjzx_">
               <w:r>
                 <w:rPr>
                   <w:rFonts w:ascii="Verdana" w:cs="Verdana" w:eastAsia="Verdana" w:hAnsi="Verdana"/>
@@ -352,7 +352,7 @@
                 <w:szCs w:val="22"/>
               </w:rPr>
             </w:pPr>
-            <w:hyperlink w:history="1" r:id="rId_njiezxhr_qozp_afmkmb">
+            <w:hyperlink w:history="1" r:id="rIdfnqn70gv_bs4wkvl5lfws">
               <w:r>
                 <w:rPr>
                   <w:rFonts w:ascii="Verdana" w:cs="Verdana" w:eastAsia="Verdana" w:hAnsi="Verdana"/>
@@ -440,7 +440,7 @@
           <w:sz w:val="22"/>
           <w:szCs w:val="22"/>
         </w:rPr>
-        <w:t xml:space="preserve">Frontend: React, Angular, JavaScript, TypeScript</w:t>
+        <w:t xml:space="preserve">Frontend: React, Angular, TypeScript, JavaScript, NgRx, RxJS</w:t>
       </w:r>
     </w:p>
     <w:p>
@@ -467,7 +467,7 @@
           <w:sz w:val="22"/>
           <w:szCs w:val="22"/>
         </w:rPr>
-        <w:t xml:space="preserve">Backend and APIs: Node.js, Python, PostgreSQL, REST APIs, AI SDKs</w:t>
+        <w:t xml:space="preserve">Backend and APIs: Node.js, Python, PostgreSQL, REST APIs</w:t>
       </w:r>
     </w:p>
     <w:p>
@@ -494,7 +494,7 @@
           <w:sz w:val="22"/>
           <w:szCs w:val="22"/>
         </w:rPr>
-        <w:t xml:space="preserve">Developer Experience: Backstage.io, Self-Service Portals, Service Catalogs, Golden Paths</w:t>
+        <w:t xml:space="preserve">Developer Platforms: Backstage.io, Software Templates, Service Catalogs, Golden Paths</w:t>
       </w:r>
     </w:p>
     <w:p>
@@ -521,7 +521,7 @@
           <w:sz w:val="22"/>
           <w:szCs w:val="22"/>
         </w:rPr>
-        <w:t xml:space="preserve">Cloud and CI/CD: Docker, Kubernetes, Helm, Argo CD, Terraform, Jenkins, GitLab CI/CD</w:t>
+        <w:t xml:space="preserve">Cloud and CI/CD: Docker, Kubernetes, Helm, Argo CD, Terraform, GitLab CI/CD</w:t>
       </w:r>
     </w:p>
     <w:p>
@@ -553,7 +553,7 @@
     <w:p>
       <w:pPr>
         <w:keepNext/>
-        <w:spacing w:after="20" w:line="220"/>
+        <w:spacing w:after="20" w:before="0" w:line="220"/>
         <w:rPr>
           <w:rFonts w:ascii="Verdana" w:cs="Verdana" w:eastAsia="Verdana" w:hAnsi="Verdana"/>
           <w:color w:val="111111"/>
@@ -577,23 +577,39 @@
     <w:p>
       <w:pPr>
         <w:keepNext/>
-        <w:spacing w:after="10" w:line="220"/>
-        <w:rPr>
-          <w:rFonts w:ascii="Verdana" w:cs="Verdana" w:eastAsia="Verdana" w:hAnsi="Verdana"/>
-          <w:color w:val="111111"/>
-          <w:sz w:val="24"/>
-          <w:szCs w:val="24"/>
-        </w:rPr>
-      </w:pPr>
-      <w:r>
-        <w:rPr>
-          <w:rFonts w:ascii="Verdana" w:cs="Verdana" w:eastAsia="Verdana" w:hAnsi="Verdana"/>
-          <w:noProof/>
-          <w:color w:val="111111"/>
-          <w:sz w:val="22"/>
-          <w:szCs w:val="22"/>
-        </w:rPr>
-        <w:t xml:space="preserve">Senior Full-Stack Developer (Oct 2023 - Present)</w:t>
+        <w:tabs>
+          <w:tab w:val="right" w:pos="11244"/>
+        </w:tabs>
+        <w:spacing w:after="10" w:before="0" w:line="220"/>
+        <w:ind w:left="180"/>
+        <w:rPr>
+          <w:rFonts w:ascii="Verdana" w:cs="Verdana" w:eastAsia="Verdana" w:hAnsi="Verdana"/>
+          <w:color w:val="111111"/>
+          <w:sz w:val="22"/>
+          <w:szCs w:val="22"/>
+        </w:rPr>
+      </w:pPr>
+      <w:r>
+        <w:rPr>
+          <w:rFonts w:ascii="Verdana" w:cs="Verdana" w:eastAsia="Verdana" w:hAnsi="Verdana"/>
+          <w:b/>
+          <w:bCs/>
+          <w:noProof/>
+          <w:color w:val="111111"/>
+          <w:sz w:val="22"/>
+          <w:szCs w:val="22"/>
+        </w:rPr>
+        <w:t xml:space="preserve">Senior Software Engineer</w:t>
+      </w:r>
+      <w:r>
+        <w:rPr>
+          <w:rFonts w:ascii="Verdana" w:cs="Verdana" w:eastAsia="Verdana" w:hAnsi="Verdana"/>
+          <w:noProof/>
+          <w:color w:val="111111"/>
+          <w:sz w:val="21"/>
+          <w:szCs w:val="21"/>
+        </w:rPr>
+        <w:t xml:space="preserve">	Mar 2024 - Present</w:t>
       </w:r>
     </w:p>
     <w:p>
@@ -604,7 +620,7 @@
           <w:numId w:val="1"/>
         </w:numPr>
         <w:spacing w:after="4" w:before="4" w:line="220"/>
-        <w:ind w:left="900" w:hanging="260"/>
+        <w:ind w:left="520" w:hanging="220"/>
         <w:rPr>
           <w:rFonts w:ascii="Verdana" w:cs="Verdana" w:eastAsia="Verdana" w:hAnsi="Verdana"/>
           <w:color w:val="111111"/>
@@ -631,7 +647,7 @@
           <w:numId w:val="1"/>
         </w:numPr>
         <w:spacing w:after="4" w:before="4" w:line="220"/>
-        <w:ind w:left="900" w:hanging="260"/>
+        <w:ind w:left="520" w:hanging="220"/>
         <w:rPr>
           <w:rFonts w:ascii="Verdana" w:cs="Verdana" w:eastAsia="Verdana" w:hAnsi="Verdana"/>
           <w:color w:val="111111"/>
@@ -658,7 +674,7 @@
           <w:numId w:val="1"/>
         </w:numPr>
         <w:spacing w:after="4" w:before="4" w:line="220"/>
-        <w:ind w:left="900" w:hanging="260"/>
+        <w:ind w:left="520" w:hanging="220"/>
         <w:rPr>
           <w:rFonts w:ascii="Verdana" w:cs="Verdana" w:eastAsia="Verdana" w:hAnsi="Verdana"/>
           <w:color w:val="111111"/>
@@ -685,7 +701,7 @@
           <w:numId w:val="1"/>
         </w:numPr>
         <w:spacing w:after="4" w:before="4" w:line="220"/>
-        <w:ind w:left="900" w:hanging="260"/>
+        <w:ind w:left="520" w:hanging="220"/>
         <w:rPr>
           <w:rFonts w:ascii="Verdana" w:cs="Verdana" w:eastAsia="Verdana" w:hAnsi="Verdana"/>
           <w:color w:val="111111"/>
@@ -706,12 +722,13 @@
     </w:p>
     <w:p>
       <w:pPr>
-        <w:spacing w:after="125" w:before="12" w:line="220"/>
-        <w:rPr>
-          <w:rFonts w:ascii="Verdana" w:cs="Verdana" w:eastAsia="Verdana" w:hAnsi="Verdana"/>
-          <w:color w:val="111111"/>
-          <w:sz w:val="22"/>
-          <w:szCs w:val="22"/>
+        <w:spacing w:after="0" w:before="12" w:line="220"/>
+        <w:ind w:left="180"/>
+        <w:rPr>
+          <w:rFonts w:ascii="Verdana" w:cs="Verdana" w:eastAsia="Verdana" w:hAnsi="Verdana"/>
+          <w:color w:val="111111"/>
+          <w:sz w:val="21"/>
+          <w:szCs w:val="21"/>
         </w:rPr>
       </w:pPr>
       <w:r>
@@ -721,8 +738,8 @@
           <w:bCs/>
           <w:noProof/>
           <w:color w:val="111111"/>
-          <w:sz w:val="22"/>
-          <w:szCs w:val="22"/>
+          <w:sz w:val="21"/>
+          <w:szCs w:val="21"/>
         </w:rPr>
         <w:t xml:space="preserve">Technologies:</w:t>
       </w:r>
@@ -731,8 +748,8 @@
           <w:rFonts w:ascii="Verdana" w:cs="Verdana" w:eastAsia="Verdana" w:hAnsi="Verdana"/>
           <w:noProof/>
           <w:color w:val="111111"/>
-          <w:sz w:val="22"/>
-          <w:szCs w:val="22"/>
+          <w:sz w:val="21"/>
+          <w:szCs w:val="21"/>
         </w:rPr>
         <w:t xml:space="preserve"> Backstage.io, TypeScript, React, Node.js, PostgreSQL, Azure AI SDK, EKS, Helm, Terraform, Argo CD, GitLab CI/CD</w:t>
       </w:r>
@@ -740,7 +757,11 @@
     <w:p>
       <w:pPr>
         <w:keepNext/>
-        <w:spacing w:after="20" w:line="220"/>
+        <w:tabs>
+          <w:tab w:val="right" w:pos="11244"/>
+        </w:tabs>
+        <w:spacing w:after="10" w:before="140" w:line="220"/>
+        <w:ind w:left="180"/>
         <w:rPr>
           <w:rFonts w:ascii="Verdana" w:cs="Verdana" w:eastAsia="Verdana" w:hAnsi="Verdana"/>
           <w:color w:val="111111"/>
@@ -755,32 +776,20 @@
           <w:bCs/>
           <w:noProof/>
           <w:color w:val="111111"/>
-          <w:sz w:val="24"/>
-          <w:szCs w:val="24"/>
-        </w:rPr>
-        <w:t xml:space="preserve">Morgan Stanley</w:t>
-      </w:r>
-    </w:p>
-    <w:p>
-      <w:pPr>
-        <w:keepNext/>
-        <w:spacing w:after="10" w:line="220"/>
-        <w:rPr>
-          <w:rFonts w:ascii="Verdana" w:cs="Verdana" w:eastAsia="Verdana" w:hAnsi="Verdana"/>
-          <w:color w:val="111111"/>
-          <w:sz w:val="24"/>
-          <w:szCs w:val="24"/>
-        </w:rPr>
-      </w:pPr>
-      <w:r>
-        <w:rPr>
-          <w:rFonts w:ascii="Verdana" w:cs="Verdana" w:eastAsia="Verdana" w:hAnsi="Verdana"/>
-          <w:noProof/>
-          <w:color w:val="111111"/>
-          <w:sz w:val="22"/>
-          <w:szCs w:val="22"/>
-        </w:rPr>
-        <w:t xml:space="preserve">Front-End Developer (Sep 2021 - Sep 2023)</w:t>
+          <w:sz w:val="22"/>
+          <w:szCs w:val="22"/>
+        </w:rPr>
+        <w:t xml:space="preserve">Senior Frontend Developer</w:t>
+      </w:r>
+      <w:r>
+        <w:rPr>
+          <w:rFonts w:ascii="Verdana" w:cs="Verdana" w:eastAsia="Verdana" w:hAnsi="Verdana"/>
+          <w:noProof/>
+          <w:color w:val="111111"/>
+          <w:sz w:val="21"/>
+          <w:szCs w:val="21"/>
+        </w:rPr>
+        <w:t xml:space="preserve">	Oct 2023 - Mar 2024</w:t>
       </w:r>
     </w:p>
     <w:p>
@@ -791,23 +800,23 @@
           <w:numId w:val="1"/>
         </w:numPr>
         <w:spacing w:after="4" w:before="4" w:line="220"/>
-        <w:ind w:left="900" w:hanging="260"/>
-        <w:rPr>
-          <w:rFonts w:ascii="Verdana" w:cs="Verdana" w:eastAsia="Verdana" w:hAnsi="Verdana"/>
-          <w:color w:val="111111"/>
-          <w:sz w:val="22"/>
-          <w:szCs w:val="22"/>
-        </w:rPr>
-      </w:pPr>
-      <w:r>
-        <w:rPr>
-          <w:rFonts w:ascii="Verdana" w:cs="Verdana" w:eastAsia="Verdana" w:hAnsi="Verdana"/>
-          <w:noProof/>
-          <w:color w:val="111111"/>
-          <w:sz w:val="22"/>
-          <w:szCs w:val="22"/>
-        </w:rPr>
-        <w:t xml:space="preserve">Implemented responsive data grids and real-time UI updates with Angular and AG Grid.</w:t>
+        <w:ind w:left="520" w:hanging="220"/>
+        <w:rPr>
+          <w:rFonts w:ascii="Verdana" w:cs="Verdana" w:eastAsia="Verdana" w:hAnsi="Verdana"/>
+          <w:color w:val="111111"/>
+          <w:sz w:val="22"/>
+          <w:szCs w:val="22"/>
+        </w:rPr>
+      </w:pPr>
+      <w:r>
+        <w:rPr>
+          <w:rFonts w:ascii="Verdana" w:cs="Verdana" w:eastAsia="Verdana" w:hAnsi="Verdana"/>
+          <w:noProof/>
+          <w:color w:val="111111"/>
+          <w:sz w:val="22"/>
+          <w:szCs w:val="22"/>
+        </w:rPr>
+        <w:t xml:space="preserve">Contributed Angular architecture to Trading.com’s multi-region launch across Europe and Australia, built high-throughput UI kits for a leading forex broker.</w:t>
       </w:r>
     </w:p>
     <w:p>
@@ -818,33 +827,34 @@
           <w:numId w:val="1"/>
         </w:numPr>
         <w:spacing w:after="4" w:before="4" w:line="220"/>
-        <w:ind w:left="900" w:hanging="260"/>
-        <w:rPr>
-          <w:rFonts w:ascii="Verdana" w:cs="Verdana" w:eastAsia="Verdana" w:hAnsi="Verdana"/>
-          <w:color w:val="111111"/>
-          <w:sz w:val="22"/>
-          <w:szCs w:val="22"/>
-        </w:rPr>
-      </w:pPr>
-      <w:r>
-        <w:rPr>
-          <w:rFonts w:ascii="Verdana" w:cs="Verdana" w:eastAsia="Verdana" w:hAnsi="Verdana"/>
-          <w:noProof/>
-          <w:color w:val="111111"/>
-          <w:sz w:val="22"/>
-          <w:szCs w:val="22"/>
-        </w:rPr>
-        <w:t xml:space="preserve">Contributed to migrating 15+ legacy desktop apps to modern web applications, eliminating broker-side installation and delivering firm clients a modern wealth management experience.</w:t>
-      </w:r>
-    </w:p>
-    <w:p>
-      <w:pPr>
-        <w:spacing w:after="125" w:before="12" w:line="220"/>
-        <w:rPr>
-          <w:rFonts w:ascii="Verdana" w:cs="Verdana" w:eastAsia="Verdana" w:hAnsi="Verdana"/>
-          <w:color w:val="111111"/>
-          <w:sz w:val="22"/>
-          <w:szCs w:val="22"/>
+        <w:ind w:left="520" w:hanging="220"/>
+        <w:rPr>
+          <w:rFonts w:ascii="Verdana" w:cs="Verdana" w:eastAsia="Verdana" w:hAnsi="Verdana"/>
+          <w:color w:val="111111"/>
+          <w:sz w:val="22"/>
+          <w:szCs w:val="22"/>
+        </w:rPr>
+      </w:pPr>
+      <w:r>
+        <w:rPr>
+          <w:rFonts w:ascii="Verdana" w:cs="Verdana" w:eastAsia="Verdana" w:hAnsi="Verdana"/>
+          <w:noProof/>
+          <w:color w:val="111111"/>
+          <w:sz w:val="22"/>
+          <w:szCs w:val="22"/>
+        </w:rPr>
+        <w:t xml:space="preserve">Defined reusable Angular component APIs and integration guidelines, helping developers build consistent interfaces across trading applications.</w:t>
+      </w:r>
+    </w:p>
+    <w:p>
+      <w:pPr>
+        <w:spacing w:after="0" w:before="12" w:line="220"/>
+        <w:ind w:left="180"/>
+        <w:rPr>
+          <w:rFonts w:ascii="Verdana" w:cs="Verdana" w:eastAsia="Verdana" w:hAnsi="Verdana"/>
+          <w:color w:val="111111"/>
+          <w:sz w:val="21"/>
+          <w:szCs w:val="21"/>
         </w:rPr>
       </w:pPr>
       <w:r>
@@ -854,8 +864,8 @@
           <w:bCs/>
           <w:noProof/>
           <w:color w:val="111111"/>
-          <w:sz w:val="22"/>
-          <w:szCs w:val="22"/>
+          <w:sz w:val="21"/>
+          <w:szCs w:val="21"/>
         </w:rPr>
         <w:t xml:space="preserve">Technologies:</w:t>
       </w:r>
@@ -864,16 +874,16 @@
           <w:rFonts w:ascii="Verdana" w:cs="Verdana" w:eastAsia="Verdana" w:hAnsi="Verdana"/>
           <w:noProof/>
           <w:color w:val="111111"/>
-          <w:sz w:val="22"/>
-          <w:szCs w:val="22"/>
-        </w:rPr>
-        <w:t xml:space="preserve"> Angular, AG Grid, RxJS, Jenkins, Jest, Karma, Jasmine, BitBucket</w:t>
+          <w:sz w:val="21"/>
+          <w:szCs w:val="21"/>
+        </w:rPr>
+        <w:t xml:space="preserve"> Angular, TypeScript, NgRx, RxJS, JavaScript, Material-UI, Internationalization (i18n)</w:t>
       </w:r>
     </w:p>
     <w:p>
       <w:pPr>
         <w:keepNext/>
-        <w:spacing w:after="20" w:line="220"/>
+        <w:spacing w:after="20" w:before="240" w:line="220"/>
         <w:rPr>
           <w:rFonts w:ascii="Verdana" w:cs="Verdana" w:eastAsia="Verdana" w:hAnsi="Verdana"/>
           <w:color w:val="111111"/>
@@ -891,29 +901,45 @@
           <w:sz w:val="24"/>
           <w:szCs w:val="24"/>
         </w:rPr>
-        <w:t xml:space="preserve">ExxonMobil</w:t>
+        <w:t xml:space="preserve">Morgan Stanley</w:t>
       </w:r>
     </w:p>
     <w:p>
       <w:pPr>
         <w:keepNext/>
-        <w:spacing w:after="10" w:line="220"/>
-        <w:rPr>
-          <w:rFonts w:ascii="Verdana" w:cs="Verdana" w:eastAsia="Verdana" w:hAnsi="Verdana"/>
-          <w:color w:val="111111"/>
-          <w:sz w:val="24"/>
-          <w:szCs w:val="24"/>
-        </w:rPr>
-      </w:pPr>
-      <w:r>
-        <w:rPr>
-          <w:rFonts w:ascii="Verdana" w:cs="Verdana" w:eastAsia="Verdana" w:hAnsi="Verdana"/>
-          <w:noProof/>
-          <w:color w:val="111111"/>
-          <w:sz w:val="22"/>
-          <w:szCs w:val="22"/>
-        </w:rPr>
-        <w:t xml:space="preserve">Full-Stack Developer (May 2018 - Aug 2021)</w:t>
+        <w:tabs>
+          <w:tab w:val="right" w:pos="11244"/>
+        </w:tabs>
+        <w:spacing w:after="10" w:before="0" w:line="220"/>
+        <w:ind w:left="180"/>
+        <w:rPr>
+          <w:rFonts w:ascii="Verdana" w:cs="Verdana" w:eastAsia="Verdana" w:hAnsi="Verdana"/>
+          <w:color w:val="111111"/>
+          <w:sz w:val="22"/>
+          <w:szCs w:val="22"/>
+        </w:rPr>
+      </w:pPr>
+      <w:r>
+        <w:rPr>
+          <w:rFonts w:ascii="Verdana" w:cs="Verdana" w:eastAsia="Verdana" w:hAnsi="Verdana"/>
+          <w:b/>
+          <w:bCs/>
+          <w:noProof/>
+          <w:color w:val="111111"/>
+          <w:sz w:val="22"/>
+          <w:szCs w:val="22"/>
+        </w:rPr>
+        <w:t xml:space="preserve">Front-End Developer</w:t>
+      </w:r>
+      <w:r>
+        <w:rPr>
+          <w:rFonts w:ascii="Verdana" w:cs="Verdana" w:eastAsia="Verdana" w:hAnsi="Verdana"/>
+          <w:noProof/>
+          <w:color w:val="111111"/>
+          <w:sz w:val="21"/>
+          <w:szCs w:val="21"/>
+        </w:rPr>
+        <w:t xml:space="preserve">	Sep 2021 - Sep 2023</w:t>
       </w:r>
     </w:p>
     <w:p>
@@ -924,23 +950,23 @@
           <w:numId w:val="1"/>
         </w:numPr>
         <w:spacing w:after="4" w:before="4" w:line="220"/>
-        <w:ind w:left="900" w:hanging="260"/>
-        <w:rPr>
-          <w:rFonts w:ascii="Verdana" w:cs="Verdana" w:eastAsia="Verdana" w:hAnsi="Verdana"/>
-          <w:color w:val="111111"/>
-          <w:sz w:val="22"/>
-          <w:szCs w:val="22"/>
-        </w:rPr>
-      </w:pPr>
-      <w:r>
-        <w:rPr>
-          <w:rFonts w:ascii="Verdana" w:cs="Verdana" w:eastAsia="Verdana" w:hAnsi="Verdana"/>
-          <w:noProof/>
-          <w:color w:val="111111"/>
-          <w:sz w:val="22"/>
-          <w:szCs w:val="22"/>
-        </w:rPr>
-        <w:t xml:space="preserve">Built a gamified employee engagement dashboard with Vue.js and Node.js.</w:t>
+        <w:ind w:left="520" w:hanging="220"/>
+        <w:rPr>
+          <w:rFonts w:ascii="Verdana" w:cs="Verdana" w:eastAsia="Verdana" w:hAnsi="Verdana"/>
+          <w:color w:val="111111"/>
+          <w:sz w:val="22"/>
+          <w:szCs w:val="22"/>
+        </w:rPr>
+      </w:pPr>
+      <w:r>
+        <w:rPr>
+          <w:rFonts w:ascii="Verdana" w:cs="Verdana" w:eastAsia="Verdana" w:hAnsi="Verdana"/>
+          <w:noProof/>
+          <w:color w:val="111111"/>
+          <w:sz w:val="22"/>
+          <w:szCs w:val="22"/>
+        </w:rPr>
+        <w:t xml:space="preserve">Implemented responsive data grids and real-time UI updates with Angular and AG Grid.</w:t>
       </w:r>
     </w:p>
     <w:p>
@@ -951,33 +977,34 @@
           <w:numId w:val="1"/>
         </w:numPr>
         <w:spacing w:after="4" w:before="4" w:line="220"/>
-        <w:ind w:left="900" w:hanging="260"/>
-        <w:rPr>
-          <w:rFonts w:ascii="Verdana" w:cs="Verdana" w:eastAsia="Verdana" w:hAnsi="Verdana"/>
-          <w:color w:val="111111"/>
-          <w:sz w:val="22"/>
-          <w:szCs w:val="22"/>
-        </w:rPr>
-      </w:pPr>
-      <w:r>
-        <w:rPr>
-          <w:rFonts w:ascii="Verdana" w:cs="Verdana" w:eastAsia="Verdana" w:hAnsi="Verdana"/>
-          <w:noProof/>
-          <w:color w:val="111111"/>
-          <w:sz w:val="22"/>
-          <w:szCs w:val="22"/>
-        </w:rPr>
-        <w:t xml:space="preserve">Helped reduce ~$100K in annual third-party tooling costs by moving email generation and styling to an internally maintained web platform.</w:t>
-      </w:r>
-    </w:p>
-    <w:p>
-      <w:pPr>
-        <w:spacing w:after="125" w:before="12" w:line="220"/>
-        <w:rPr>
-          <w:rFonts w:ascii="Verdana" w:cs="Verdana" w:eastAsia="Verdana" w:hAnsi="Verdana"/>
-          <w:color w:val="111111"/>
-          <w:sz w:val="22"/>
-          <w:szCs w:val="22"/>
+        <w:ind w:left="520" w:hanging="220"/>
+        <w:rPr>
+          <w:rFonts w:ascii="Verdana" w:cs="Verdana" w:eastAsia="Verdana" w:hAnsi="Verdana"/>
+          <w:color w:val="111111"/>
+          <w:sz w:val="22"/>
+          <w:szCs w:val="22"/>
+        </w:rPr>
+      </w:pPr>
+      <w:r>
+        <w:rPr>
+          <w:rFonts w:ascii="Verdana" w:cs="Verdana" w:eastAsia="Verdana" w:hAnsi="Verdana"/>
+          <w:noProof/>
+          <w:color w:val="111111"/>
+          <w:sz w:val="22"/>
+          <w:szCs w:val="22"/>
+        </w:rPr>
+        <w:t xml:space="preserve">Contributed to migrating 15+ legacy desktop apps to modern web applications, eliminating broker-side installation and delivering firm clients a modern wealth management experience.</w:t>
+      </w:r>
+    </w:p>
+    <w:p>
+      <w:pPr>
+        <w:spacing w:after="0" w:before="12" w:line="220"/>
+        <w:ind w:left="180"/>
+        <w:rPr>
+          <w:rFonts w:ascii="Verdana" w:cs="Verdana" w:eastAsia="Verdana" w:hAnsi="Verdana"/>
+          <w:color w:val="111111"/>
+          <w:sz w:val="21"/>
+          <w:szCs w:val="21"/>
         </w:rPr>
       </w:pPr>
       <w:r>
@@ -987,8 +1014,8 @@
           <w:bCs/>
           <w:noProof/>
           <w:color w:val="111111"/>
-          <w:sz w:val="22"/>
-          <w:szCs w:val="22"/>
+          <w:sz w:val="21"/>
+          <w:szCs w:val="21"/>
         </w:rPr>
         <w:t xml:space="preserve">Technologies:</w:t>
       </w:r>
@@ -997,8 +1024,158 @@
           <w:rFonts w:ascii="Verdana" w:cs="Verdana" w:eastAsia="Verdana" w:hAnsi="Verdana"/>
           <w:noProof/>
           <w:color w:val="111111"/>
-          <w:sz w:val="22"/>
-          <w:szCs w:val="22"/>
+          <w:sz w:val="21"/>
+          <w:szCs w:val="21"/>
+        </w:rPr>
+        <w:t xml:space="preserve"> Angular, AG Grid, RxJS, Jenkins, Jest, Karma, Jasmine, BitBucket</w:t>
+      </w:r>
+    </w:p>
+    <w:p>
+      <w:pPr>
+        <w:keepNext/>
+        <w:spacing w:after="20" w:before="240" w:line="220"/>
+        <w:rPr>
+          <w:rFonts w:ascii="Verdana" w:cs="Verdana" w:eastAsia="Verdana" w:hAnsi="Verdana"/>
+          <w:color w:val="111111"/>
+          <w:sz w:val="22"/>
+          <w:szCs w:val="22"/>
+        </w:rPr>
+      </w:pPr>
+      <w:r>
+        <w:rPr>
+          <w:rFonts w:ascii="Verdana" w:cs="Verdana" w:eastAsia="Verdana" w:hAnsi="Verdana"/>
+          <w:b/>
+          <w:bCs/>
+          <w:noProof/>
+          <w:color w:val="111111"/>
+          <w:sz w:val="24"/>
+          <w:szCs w:val="24"/>
+        </w:rPr>
+        <w:t xml:space="preserve">ExxonMobil</w:t>
+      </w:r>
+    </w:p>
+    <w:p>
+      <w:pPr>
+        <w:keepNext/>
+        <w:tabs>
+          <w:tab w:val="right" w:pos="11244"/>
+        </w:tabs>
+        <w:spacing w:after="10" w:before="0" w:line="220"/>
+        <w:ind w:left="180"/>
+        <w:rPr>
+          <w:rFonts w:ascii="Verdana" w:cs="Verdana" w:eastAsia="Verdana" w:hAnsi="Verdana"/>
+          <w:color w:val="111111"/>
+          <w:sz w:val="22"/>
+          <w:szCs w:val="22"/>
+        </w:rPr>
+      </w:pPr>
+      <w:r>
+        <w:rPr>
+          <w:rFonts w:ascii="Verdana" w:cs="Verdana" w:eastAsia="Verdana" w:hAnsi="Verdana"/>
+          <w:b/>
+          <w:bCs/>
+          <w:noProof/>
+          <w:color w:val="111111"/>
+          <w:sz w:val="22"/>
+          <w:szCs w:val="22"/>
+        </w:rPr>
+        <w:t xml:space="preserve">Full-Stack Developer</w:t>
+      </w:r>
+      <w:r>
+        <w:rPr>
+          <w:rFonts w:ascii="Verdana" w:cs="Verdana" w:eastAsia="Verdana" w:hAnsi="Verdana"/>
+          <w:noProof/>
+          <w:color w:val="111111"/>
+          <w:sz w:val="21"/>
+          <w:szCs w:val="21"/>
+        </w:rPr>
+        <w:t xml:space="preserve">	May 2018 - Aug 2021</w:t>
+      </w:r>
+    </w:p>
+    <w:p>
+      <w:pPr>
+        <w:pStyle w:val="ListParagraph"/>
+        <w:numPr>
+          <w:ilvl w:val="0"/>
+          <w:numId w:val="1"/>
+        </w:numPr>
+        <w:spacing w:after="4" w:before="4" w:line="220"/>
+        <w:ind w:left="520" w:hanging="220"/>
+        <w:rPr>
+          <w:rFonts w:ascii="Verdana" w:cs="Verdana" w:eastAsia="Verdana" w:hAnsi="Verdana"/>
+          <w:color w:val="111111"/>
+          <w:sz w:val="22"/>
+          <w:szCs w:val="22"/>
+        </w:rPr>
+      </w:pPr>
+      <w:r>
+        <w:rPr>
+          <w:rFonts w:ascii="Verdana" w:cs="Verdana" w:eastAsia="Verdana" w:hAnsi="Verdana"/>
+          <w:noProof/>
+          <w:color w:val="111111"/>
+          <w:sz w:val="22"/>
+          <w:szCs w:val="22"/>
+        </w:rPr>
+        <w:t xml:space="preserve">Built a gamified employee engagement dashboard with Vue.js and Node.js.</w:t>
+      </w:r>
+    </w:p>
+    <w:p>
+      <w:pPr>
+        <w:pStyle w:val="ListParagraph"/>
+        <w:numPr>
+          <w:ilvl w:val="0"/>
+          <w:numId w:val="1"/>
+        </w:numPr>
+        <w:spacing w:after="4" w:before="4" w:line="220"/>
+        <w:ind w:left="520" w:hanging="220"/>
+        <w:rPr>
+          <w:rFonts w:ascii="Verdana" w:cs="Verdana" w:eastAsia="Verdana" w:hAnsi="Verdana"/>
+          <w:color w:val="111111"/>
+          <w:sz w:val="22"/>
+          <w:szCs w:val="22"/>
+        </w:rPr>
+      </w:pPr>
+      <w:r>
+        <w:rPr>
+          <w:rFonts w:ascii="Verdana" w:cs="Verdana" w:eastAsia="Verdana" w:hAnsi="Verdana"/>
+          <w:noProof/>
+          <w:color w:val="111111"/>
+          <w:sz w:val="22"/>
+          <w:szCs w:val="22"/>
+        </w:rPr>
+        <w:t xml:space="preserve">Helped reduce ~$100K in annual third-party tooling costs by moving email generation and styling to an internally maintained web platform.</w:t>
+      </w:r>
+    </w:p>
+    <w:p>
+      <w:pPr>
+        <w:spacing w:after="0" w:before="12" w:line="220"/>
+        <w:ind w:left="180"/>
+        <w:rPr>
+          <w:rFonts w:ascii="Verdana" w:cs="Verdana" w:eastAsia="Verdana" w:hAnsi="Verdana"/>
+          <w:color w:val="111111"/>
+          <w:sz w:val="21"/>
+          <w:szCs w:val="21"/>
+        </w:rPr>
+      </w:pPr>
+      <w:r>
+        <w:rPr>
+          <w:rFonts w:ascii="Verdana" w:cs="Verdana" w:eastAsia="Verdana" w:hAnsi="Verdana"/>
+          <w:b/>
+          <w:bCs/>
+          <w:noProof/>
+          <w:color w:val="111111"/>
+          <w:sz w:val="21"/>
+          <w:szCs w:val="21"/>
+        </w:rPr>
+        <w:t xml:space="preserve">Technologies:</w:t>
+      </w:r>
+      <w:r>
+        <w:rPr>
+          <w:rFonts w:ascii="Verdana" w:cs="Verdana" w:eastAsia="Verdana" w:hAnsi="Verdana"/>
+          <w:noProof/>
+          <w:color w:val="111111"/>
+          <w:sz w:val="21"/>
+          <w:szCs w:val="21"/>
         </w:rPr>
         <w:t xml:space="preserve"> Vue.js, Node.js, Vuex, MongoDB, Amazon S3, SharePoint APIs</w:t>
       </w:r>
@@ -1094,7 +1271,7 @@
         </w:rPr>
         <w:t xml:space="preserve">GitHub: </w:t>
       </w:r>
-      <w:hyperlink w:history="1" r:id="rIdlui3paljtfep3hm7tg-dy">
+      <w:hyperlink w:history="1" r:id="rIdfhm0sz6zgtt-e7co2pafg">
         <w:r>
           <w:rPr>
             <w:rFonts w:ascii="Verdana" w:cs="Verdana" w:eastAsia="Verdana" w:hAnsi="Verdana"/>
@@ -1105,85 +1282,6 @@
             <w:u w:val="single" w:color="111111"/>
           </w:rPr>
           <w:t xml:space="preserve">alibayramli/me</w:t>
-        </w:r>
-      </w:hyperlink>
-    </w:p>
-    <w:p>
-      <w:pPr>
-        <w:keepNext/>
-        <w:spacing w:after="0" w:line="220"/>
-        <w:rPr>
-          <w:rFonts w:ascii="Verdana" w:cs="Verdana" w:eastAsia="Verdana" w:hAnsi="Verdana"/>
-          <w:color w:val="111111"/>
-          <w:sz w:val="22"/>
-          <w:szCs w:val="22"/>
-        </w:rPr>
-      </w:pPr>
-      <w:r>
-        <w:rPr>
-          <w:rFonts w:ascii="Verdana" w:cs="Verdana" w:eastAsia="Verdana" w:hAnsi="Verdana"/>
-          <w:b/>
-          <w:bCs/>
-          <w:noProof/>
-          <w:color w:val="111111"/>
-          <w:sz w:val="24"/>
-          <w:szCs w:val="24"/>
-        </w:rPr>
-        <w:t xml:space="preserve">FX Notifier</w:t>
-      </w:r>
-    </w:p>
-    <w:p>
-      <w:pPr>
-        <w:spacing w:after="125" w:before="0" w:line="220"/>
-        <w:rPr>
-          <w:rFonts w:ascii="Verdana" w:cs="Verdana" w:eastAsia="Verdana" w:hAnsi="Verdana"/>
-          <w:color w:val="111111"/>
-          <w:sz w:val="22"/>
-          <w:szCs w:val="22"/>
-        </w:rPr>
-      </w:pPr>
-      <w:r>
-        <w:rPr>
-          <w:rFonts w:ascii="Verdana" w:cs="Verdana" w:eastAsia="Verdana" w:hAnsi="Verdana"/>
-          <w:noProof/>
-          <w:color w:val="111111"/>
-          <w:sz w:val="22"/>
-          <w:szCs w:val="22"/>
-        </w:rPr>
-        <w:t xml:space="preserve">Python automation for weekday Telegram FX updates with validation, derived rates, and scheduling.</w:t>
-      </w:r>
-      <w:r>
-        <w:rPr>
-          <w:rFonts w:ascii="Verdana" w:cs="Verdana" w:eastAsia="Verdana" w:hAnsi="Verdana"/>
-          <w:noProof/>
-          <w:color w:val="111111"/>
-          <w:sz w:val="22"/>
-          <w:szCs w:val="22"/>
-        </w:rPr>
-        <w:br/>
-        <w:t xml:space="preserve"/>
-      </w:r>
-      <w:r>
-        <w:rPr>
-          <w:rFonts w:ascii="Verdana" w:cs="Verdana" w:eastAsia="Verdana" w:hAnsi="Verdana"/>
-          <w:noProof/>
-          <w:color w:val="111111"/>
-          <w:sz w:val="22"/>
-          <w:szCs w:val="22"/>
-        </w:rPr>
-        <w:t xml:space="preserve">GitHub: </w:t>
-      </w:r>
-      <w:hyperlink w:history="1" r:id="rId8es_dynki11jfdmgmnzby">
-        <w:r>
-          <w:rPr>
-            <w:rFonts w:ascii="Verdana" w:cs="Verdana" w:eastAsia="Verdana" w:hAnsi="Verdana"/>
-            <w:noProof/>
-            <w:color w:val="111111"/>
-            <w:sz w:val="22"/>
-            <w:szCs w:val="22"/>
-            <w:u w:val="single" w:color="111111"/>
-          </w:rPr>
-          <w:t xml:space="preserve">alibayramli/fx-notifier</w:t>
         </w:r>
       </w:hyperlink>
     </w:p>

</xml_diff>

<commit_message>
chore: update personal project
</commit_message>
<xml_diff>
--- a/public/resume/Ali_Bayramli_Resume.docx
+++ b/public/resume/Ali_Bayramli_Resume.docx
@@ -158,7 +158,7 @@
               </w:rPr>
               <w:t xml:space="preserve"> </w:t>
             </w:r>
-            <w:hyperlink w:history="1" r:id="rIdvj0apo9n6jlqeitchpsbx">
+            <w:hyperlink w:history="1" r:id="rId-9-guq-cnkdkvyd9n6ylp">
               <w:r>
                 <w:rPr>
                   <w:rFonts w:ascii="Verdana" w:cs="Verdana" w:eastAsia="Verdana" w:hAnsi="Verdana"/>
@@ -221,7 +221,7 @@
               </w:rPr>
               <w:t xml:space="preserve"> </w:t>
             </w:r>
-            <w:hyperlink w:history="1" r:id="rIdgyv4rkddijilhfrvlbfm1">
+            <w:hyperlink w:history="1" r:id="rIdglpzffmq-qrnognbamhxm">
               <w:r>
                 <w:rPr>
                   <w:rFonts w:ascii="Verdana" w:cs="Verdana" w:eastAsia="Verdana" w:hAnsi="Verdana"/>
@@ -266,7 +266,7 @@
                 <w:szCs w:val="22"/>
               </w:rPr>
             </w:pPr>
-            <w:hyperlink w:history="1" r:id="rIdqmvpmp7pedckd2utbmhp8">
+            <w:hyperlink w:history="1" r:id="rIdtahlzk6-ungzee6odcwxw">
               <w:r>
                 <w:rPr>
                   <w:rFonts w:ascii="Verdana" w:cs="Verdana" w:eastAsia="Verdana" w:hAnsi="Verdana"/>
@@ -309,7 +309,7 @@
                 <w:szCs w:val="22"/>
               </w:rPr>
             </w:pPr>
-            <w:hyperlink w:history="1" r:id="rIdosyusjgupsvq7wtxzsrro">
+            <w:hyperlink w:history="1" r:id="rIdmqokfsepoqp6vqz1du54d">
               <w:r>
                 <w:rPr>
                   <w:rFonts w:ascii="Verdana" w:cs="Verdana" w:eastAsia="Verdana" w:hAnsi="Verdana"/>
@@ -352,7 +352,7 @@
                 <w:szCs w:val="22"/>
               </w:rPr>
             </w:pPr>
-            <w:hyperlink w:history="1" r:id="rId7sh80-ce3eqnr7ko4mc55">
+            <w:hyperlink w:history="1" r:id="rId_ejigtzw-urabx--ybpy6">
               <w:r>
                 <w:rPr>
                   <w:rFonts w:ascii="Verdana" w:cs="Verdana" w:eastAsia="Verdana" w:hAnsi="Verdana"/>
@@ -1227,7 +1227,7 @@
           <w:sz w:val="24"/>
           <w:szCs w:val="24"/>
         </w:rPr>
-        <w:t xml:space="preserve">Portfolio &amp; Blog Platform</w:t>
+        <w:t xml:space="preserve">Template Pulse</w:t>
       </w:r>
     </w:p>
     <w:p>
@@ -1248,7 +1248,7 @@
           <w:sz w:val="22"/>
           <w:szCs w:val="22"/>
         </w:rPr>
-        <w:t xml:space="preserve">Portfolio and blog showcasing projects, practical experience, challenges solved, impact, and professional growth.</w:t>
+        <w:t xml:space="preserve">Built a Backstage plugin with React and Node.js to track software template adoption, success rates, and execution times, with searchable run history and permission-based access.</w:t>
       </w:r>
       <w:r>
         <w:rPr>
@@ -1271,7 +1271,7 @@
         </w:rPr>
         <w:t xml:space="preserve">GitHub: </w:t>
       </w:r>
-      <w:hyperlink w:history="1" r:id="rIdskowlcxwefcdasuy6ctjj">
+      <w:hyperlink w:history="1" r:id="rIddb4ojq3rqirxepoj-jjp3">
         <w:r>
           <w:rPr>
             <w:rFonts w:ascii="Verdana" w:cs="Verdana" w:eastAsia="Verdana" w:hAnsi="Verdana"/>
@@ -1281,7 +1281,7 @@
             <w:szCs w:val="22"/>
             <w:u w:val="single" w:color="111111"/>
           </w:rPr>
-          <w:t xml:space="preserve">alibayramli/me</w:t>
+          <w:t xml:space="preserve">alibayramli/template-pulse</w:t>
         </w:r>
       </w:hyperlink>
     </w:p>

</xml_diff>

<commit_message>
chore: update resume generation
</commit_message>
<xml_diff>
--- a/public/resume/Ali_Bayramli_Resume.docx
+++ b/public/resume/Ali_Bayramli_Resume.docx
@@ -25,350 +25,211 @@
         <w:t xml:space="preserve">Ali Bayramli, Senior Software Engineer</w:t>
       </w:r>
     </w:p>
-    <w:tbl>
-      <w:tblPr>
-        <w:tblW w:type="pct" w:w="100%"/>
-        <w:tblBorders>
-          <w:top w:val="none" w:color="FFFFFF" w:sz="0"/>
-          <w:left w:val="none" w:color="FFFFFF" w:sz="0"/>
-          <w:bottom w:val="none" w:color="FFFFFF" w:sz="0"/>
-          <w:right w:val="none" w:color="FFFFFF" w:sz="0"/>
-          <w:insideH w:val="none" w:color="FFFFFF" w:sz="0"/>
-          <w:insideV w:val="none" w:color="FFFFFF" w:sz="0"/>
-        </w:tblBorders>
-        <w:tblLayout w:type="fixed"/>
-        <w:tblCellMar>
-          <w:top w:type="dxa" w:w="0"/>
-          <w:left w:type="dxa" w:w="0"/>
-          <w:bottom w:type="dxa" w:w="0"/>
-          <w:right w:type="dxa" w:w="0"/>
-        </w:tblCellMar>
-      </w:tblPr>
-      <w:tblGrid>
-        <w:gridCol w:w="3300"/>
-        <w:gridCol w:w="3300"/>
-        <w:gridCol w:w="5306"/>
-      </w:tblGrid>
-      <w:tr>
-        <w:tc>
-          <w:tcPr>
-            <w:tcW w:type="pct" w:w="27.717%"/>
-            <w:tcBorders>
-              <w:top w:val="none" w:color="FFFFFF" w:sz="0"/>
-              <w:left w:val="none" w:color="FFFFFF" w:sz="0"/>
-              <w:bottom w:val="none" w:color="FFFFFF" w:sz="0"/>
-              <w:right w:val="none" w:color="FFFFFF" w:sz="0"/>
-            </w:tcBorders>
-            <w:tcMar>
-              <w:top w:type="dxa" w:w="0"/>
-              <w:left w:type="dxa" w:w="0"/>
-              <w:bottom w:type="dxa" w:w="10"/>
-              <w:right w:type="dxa" w:w="0"/>
-            </w:tcMar>
-            <w:vAlign w:val="center"/>
-          </w:tcPr>
-          <w:p>
-            <w:pPr>
-              <w:spacing w:after="0" w:line="220"/>
-              <w:jc w:val="left"/>
-              <w:rPr>
-                <w:rFonts w:ascii="Verdana" w:cs="Verdana" w:eastAsia="Verdana" w:hAnsi="Verdana"/>
-                <w:color w:val="111111"/>
-                <w:sz w:val="22"/>
-                <w:szCs w:val="22"/>
-              </w:rPr>
-            </w:pPr>
-            <w:r>
-              <w:rPr>
-                <w:rFonts w:ascii="Verdana" w:cs="Verdana" w:eastAsia="Verdana" w:hAnsi="Verdana"/>
-                <w:noProof/>
-                <w:color w:val="111111"/>
-                <w:sz w:val="22"/>
-                <w:szCs w:val="22"/>
-              </w:rPr>
-              <w:t xml:space="preserve">Location:</w:t>
-            </w:r>
-            <w:r>
-              <w:rPr>
-                <w:rFonts w:ascii="Verdana" w:cs="Verdana" w:eastAsia="Verdana" w:hAnsi="Verdana"/>
-                <w:noProof/>
-                <w:color w:val="111111"/>
-                <w:sz w:val="22"/>
-                <w:szCs w:val="22"/>
-              </w:rPr>
-              <w:t xml:space="preserve"> </w:t>
-            </w:r>
-            <w:r>
-              <w:rPr>
-                <w:rFonts w:ascii="Verdana" w:cs="Verdana" w:eastAsia="Verdana" w:hAnsi="Verdana"/>
-                <w:noProof/>
-                <w:color w:val="111111"/>
-                <w:sz w:val="22"/>
-                <w:szCs w:val="22"/>
-              </w:rPr>
-              <w:t xml:space="preserve">Baku, Azerbaijan</w:t>
-            </w:r>
-          </w:p>
-        </w:tc>
-        <w:tc>
-          <w:tcPr>
-            <w:tcW w:type="pct" w:w="27.717%"/>
-            <w:tcBorders>
-              <w:top w:val="none" w:color="FFFFFF" w:sz="0"/>
-              <w:left w:val="none" w:color="FFFFFF" w:sz="0"/>
-              <w:bottom w:val="none" w:color="FFFFFF" w:sz="0"/>
-              <w:right w:val="none" w:color="FFFFFF" w:sz="0"/>
-            </w:tcBorders>
-            <w:tcMar>
-              <w:top w:type="dxa" w:w="0"/>
-              <w:left w:type="dxa" w:w="350"/>
-              <w:bottom w:type="dxa" w:w="10"/>
-              <w:right w:type="dxa" w:w="0"/>
-            </w:tcMar>
-            <w:vAlign w:val="center"/>
-          </w:tcPr>
-          <w:p>
-            <w:pPr>
-              <w:spacing w:after="0" w:line="220"/>
-              <w:jc w:val="left"/>
-              <w:rPr>
-                <w:rFonts w:ascii="Verdana" w:cs="Verdana" w:eastAsia="Verdana" w:hAnsi="Verdana"/>
-                <w:color w:val="111111"/>
-                <w:sz w:val="22"/>
-                <w:szCs w:val="22"/>
-              </w:rPr>
-            </w:pPr>
-            <w:r>
-              <w:rPr>
-                <w:rFonts w:ascii="Verdana" w:cs="Verdana" w:eastAsia="Verdana" w:hAnsi="Verdana"/>
-                <w:noProof/>
-                <w:color w:val="111111"/>
-                <w:sz w:val="22"/>
-                <w:szCs w:val="22"/>
-              </w:rPr>
-              <w:t xml:space="preserve">Phone:</w:t>
-            </w:r>
-            <w:r>
-              <w:rPr>
-                <w:rFonts w:ascii="Verdana" w:cs="Verdana" w:eastAsia="Verdana" w:hAnsi="Verdana"/>
-                <w:noProof/>
-                <w:color w:val="111111"/>
-                <w:sz w:val="22"/>
-                <w:szCs w:val="22"/>
-              </w:rPr>
-              <w:t xml:space="preserve"> </w:t>
-            </w:r>
-            <w:hyperlink w:history="1" r:id="rId-9-guq-cnkdkvyd9n6ylp">
-              <w:r>
-                <w:rPr>
-                  <w:rFonts w:ascii="Verdana" w:cs="Verdana" w:eastAsia="Verdana" w:hAnsi="Verdana"/>
-                  <w:noProof/>
-                  <w:color w:val="111111"/>
-                  <w:sz w:val="22"/>
-                  <w:szCs w:val="22"/>
-                  <w:u w:val="single" w:color="111111"/>
-                </w:rPr>
-                <w:t xml:space="preserve">+994773183356</w:t>
-              </w:r>
-            </w:hyperlink>
-          </w:p>
-        </w:tc>
-        <w:tc>
-          <w:tcPr>
-            <w:tcW w:type="pct" w:w="44.566%"/>
-            <w:tcBorders>
-              <w:top w:val="none" w:color="FFFFFF" w:sz="0"/>
-              <w:left w:val="none" w:color="FFFFFF" w:sz="0"/>
-              <w:bottom w:val="none" w:color="FFFFFF" w:sz="0"/>
-              <w:right w:val="none" w:color="FFFFFF" w:sz="0"/>
-            </w:tcBorders>
-            <w:tcMar>
-              <w:top w:type="dxa" w:w="0"/>
-              <w:left w:type="dxa" w:w="590"/>
-              <w:bottom w:type="dxa" w:w="10"/>
-              <w:right w:type="dxa" w:w="0"/>
-            </w:tcMar>
-            <w:vAlign w:val="center"/>
-          </w:tcPr>
-          <w:p>
-            <w:pPr>
-              <w:spacing w:after="0" w:line="220"/>
-              <w:jc w:val="left"/>
-              <w:rPr>
-                <w:rFonts w:ascii="Verdana" w:cs="Verdana" w:eastAsia="Verdana" w:hAnsi="Verdana"/>
-                <w:color w:val="111111"/>
-                <w:sz w:val="22"/>
-                <w:szCs w:val="22"/>
-              </w:rPr>
-            </w:pPr>
-            <w:r>
-              <w:rPr>
-                <w:rFonts w:ascii="Verdana" w:cs="Verdana" w:eastAsia="Verdana" w:hAnsi="Verdana"/>
-                <w:noProof/>
-                <w:color w:val="111111"/>
-                <w:sz w:val="22"/>
-                <w:szCs w:val="22"/>
-              </w:rPr>
-              <w:t xml:space="preserve">Email:</w:t>
-            </w:r>
-            <w:r>
-              <w:rPr>
-                <w:rFonts w:ascii="Verdana" w:cs="Verdana" w:eastAsia="Verdana" w:hAnsi="Verdana"/>
-                <w:noProof/>
-                <w:color w:val="111111"/>
-                <w:sz w:val="22"/>
-                <w:szCs w:val="22"/>
-              </w:rPr>
-              <w:t xml:space="preserve"> </w:t>
-            </w:r>
-            <w:hyperlink w:history="1" r:id="rIdglpzffmq-qrnognbamhxm">
-              <w:r>
-                <w:rPr>
-                  <w:rFonts w:ascii="Verdana" w:cs="Verdana" w:eastAsia="Verdana" w:hAnsi="Verdana"/>
-                  <w:noProof/>
-                  <w:color w:val="111111"/>
-                  <w:sz w:val="22"/>
-                  <w:szCs w:val="22"/>
-                  <w:u w:val="single" w:color="111111"/>
-                </w:rPr>
-                <w:t xml:space="preserve">bayramliialii@gmail.com</w:t>
-              </w:r>
-            </w:hyperlink>
-          </w:p>
-        </w:tc>
-      </w:tr>
-      <w:tr>
-        <w:tc>
-          <w:tcPr>
-            <w:tcW w:type="pct" w:w="27.717%"/>
-            <w:tcBorders>
-              <w:top w:val="none" w:color="FFFFFF" w:sz="0"/>
-              <w:left w:val="none" w:color="FFFFFF" w:sz="0"/>
-              <w:bottom w:val="none" w:color="FFFFFF" w:sz="0"/>
-              <w:right w:val="none" w:color="FFFFFF" w:sz="0"/>
-            </w:tcBorders>
-            <w:tcMar>
-              <w:top w:type="dxa" w:w="0"/>
-              <w:left w:type="dxa" w:w="0"/>
-              <w:bottom w:type="dxa" w:w="10"/>
-              <w:right w:type="dxa" w:w="0"/>
-            </w:tcMar>
-            <w:vAlign w:val="center"/>
-          </w:tcPr>
-          <w:p>
-            <w:pPr>
-              <w:spacing w:after="0" w:line="220"/>
-              <w:jc w:val="left"/>
-              <w:rPr>
-                <w:rFonts w:ascii="Verdana" w:cs="Verdana" w:eastAsia="Verdana" w:hAnsi="Verdana"/>
-                <w:color w:val="111111"/>
-                <w:sz w:val="22"/>
-                <w:szCs w:val="22"/>
-              </w:rPr>
-            </w:pPr>
-            <w:hyperlink w:history="1" r:id="rIdtahlzk6-ungzee6odcwxw">
-              <w:r>
-                <w:rPr>
-                  <w:rFonts w:ascii="Verdana" w:cs="Verdana" w:eastAsia="Verdana" w:hAnsi="Verdana"/>
-                  <w:noProof/>
-                  <w:color w:val="111111"/>
-                  <w:sz w:val="22"/>
-                  <w:szCs w:val="22"/>
-                  <w:u w:val="single" w:color="111111"/>
-                </w:rPr>
-                <w:t xml:space="preserve">alibayramli.github.io/me</w:t>
-              </w:r>
-            </w:hyperlink>
-          </w:p>
-        </w:tc>
-        <w:tc>
-          <w:tcPr>
-            <w:tcW w:type="pct" w:w="27.717%"/>
-            <w:tcBorders>
-              <w:top w:val="none" w:color="FFFFFF" w:sz="0"/>
-              <w:left w:val="none" w:color="FFFFFF" w:sz="0"/>
-              <w:bottom w:val="none" w:color="FFFFFF" w:sz="0"/>
-              <w:right w:val="none" w:color="FFFFFF" w:sz="0"/>
-            </w:tcBorders>
-            <w:tcMar>
-              <w:top w:type="dxa" w:w="0"/>
-              <w:left w:type="dxa" w:w="350"/>
-              <w:bottom w:type="dxa" w:w="10"/>
-              <w:right w:type="dxa" w:w="0"/>
-            </w:tcMar>
-            <w:vAlign w:val="center"/>
-          </w:tcPr>
-          <w:p>
-            <w:pPr>
-              <w:spacing w:after="0" w:line="220"/>
-              <w:jc w:val="left"/>
-              <w:rPr>
-                <w:rFonts w:ascii="Verdana" w:cs="Verdana" w:eastAsia="Verdana" w:hAnsi="Verdana"/>
-                <w:color w:val="111111"/>
-                <w:sz w:val="22"/>
-                <w:szCs w:val="22"/>
-              </w:rPr>
-            </w:pPr>
-            <w:hyperlink w:history="1" r:id="rIdmqokfsepoqp6vqz1du54d">
-              <w:r>
-                <w:rPr>
-                  <w:rFonts w:ascii="Verdana" w:cs="Verdana" w:eastAsia="Verdana" w:hAnsi="Verdana"/>
-                  <w:noProof/>
-                  <w:color w:val="111111"/>
-                  <w:sz w:val="22"/>
-                  <w:szCs w:val="22"/>
-                  <w:u w:val="single" w:color="111111"/>
-                </w:rPr>
-                <w:t xml:space="preserve">github.com/alibayramli</w:t>
-              </w:r>
-            </w:hyperlink>
-          </w:p>
-        </w:tc>
-        <w:tc>
-          <w:tcPr>
-            <w:tcW w:type="pct" w:w="44.566%"/>
-            <w:tcBorders>
-              <w:top w:val="none" w:color="FFFFFF" w:sz="0"/>
-              <w:left w:val="none" w:color="FFFFFF" w:sz="0"/>
-              <w:bottom w:val="none" w:color="FFFFFF" w:sz="0"/>
-              <w:right w:val="none" w:color="FFFFFF" w:sz="0"/>
-            </w:tcBorders>
-            <w:tcMar>
-              <w:top w:type="dxa" w:w="0"/>
-              <w:left w:type="dxa" w:w="590"/>
-              <w:bottom w:type="dxa" w:w="10"/>
-              <w:right w:type="dxa" w:w="0"/>
-            </w:tcMar>
-            <w:vAlign w:val="center"/>
-          </w:tcPr>
-          <w:p>
-            <w:pPr>
-              <w:spacing w:after="0" w:line="220"/>
-              <w:jc w:val="left"/>
-              <w:rPr>
-                <w:rFonts w:ascii="Verdana" w:cs="Verdana" w:eastAsia="Verdana" w:hAnsi="Verdana"/>
-                <w:color w:val="111111"/>
-                <w:sz w:val="22"/>
-                <w:szCs w:val="22"/>
-              </w:rPr>
-            </w:pPr>
-            <w:hyperlink w:history="1" r:id="rId_ejigtzw-urabx--ybpy6">
-              <w:r>
-                <w:rPr>
-                  <w:rFonts w:ascii="Verdana" w:cs="Verdana" w:eastAsia="Verdana" w:hAnsi="Verdana"/>
-                  <w:noProof/>
-                  <w:color w:val="111111"/>
-                  <w:sz w:val="22"/>
-                  <w:szCs w:val="22"/>
-                  <w:u w:val="single" w:color="111111"/>
-                </w:rPr>
-                <w:t xml:space="preserve">linkedin.com/in/alibayramli</w:t>
-              </w:r>
-            </w:hyperlink>
-          </w:p>
-        </w:tc>
-      </w:tr>
-    </w:tbl>
+    <w:p>
+      <w:pPr>
+        <w:tabs>
+          <w:tab w:val="left" w:pos="3748"/>
+          <w:tab w:val="left" w:pos="7496"/>
+        </w:tabs>
+        <w:spacing w:after="10" w:line="220"/>
+        <w:rPr>
+          <w:rFonts w:ascii="Verdana" w:cs="Verdana" w:eastAsia="Verdana" w:hAnsi="Verdana"/>
+          <w:color w:val="111111"/>
+          <w:sz w:val="22"/>
+          <w:szCs w:val="22"/>
+        </w:rPr>
+      </w:pPr>
+      <w:r>
+        <w:rPr>
+          <w:rFonts w:ascii="Verdana" w:cs="Verdana" w:eastAsia="Verdana" w:hAnsi="Verdana"/>
+          <w:noProof/>
+          <w:color w:val="111111"/>
+          <w:sz w:val="22"/>
+          <w:szCs w:val="22"/>
+        </w:rPr>
+        <w:t xml:space="preserve">Location:</w:t>
+      </w:r>
+      <w:r>
+        <w:rPr>
+          <w:rFonts w:ascii="Verdana" w:cs="Verdana" w:eastAsia="Verdana" w:hAnsi="Verdana"/>
+          <w:noProof/>
+          <w:color w:val="111111"/>
+          <w:sz w:val="22"/>
+          <w:szCs w:val="22"/>
+        </w:rPr>
+        <w:t xml:space="preserve"> </w:t>
+      </w:r>
+      <w:r>
+        <w:rPr>
+          <w:rFonts w:ascii="Verdana" w:cs="Verdana" w:eastAsia="Verdana" w:hAnsi="Verdana"/>
+          <w:noProof/>
+          <w:color w:val="111111"/>
+          <w:sz w:val="22"/>
+          <w:szCs w:val="22"/>
+        </w:rPr>
+        <w:t xml:space="preserve">Baku, Azerbaijan</w:t>
+      </w:r>
+      <w:r>
+        <w:rPr>
+          <w:rFonts w:ascii="Verdana" w:cs="Verdana" w:eastAsia="Verdana" w:hAnsi="Verdana"/>
+          <w:noProof/>
+          <w:color w:val="111111"/>
+          <w:sz w:val="22"/>
+          <w:szCs w:val="22"/>
+        </w:rPr>
+        <w:t xml:space="preserve">	</w:t>
+      </w:r>
+      <w:r>
+        <w:rPr>
+          <w:rFonts w:ascii="Verdana" w:cs="Verdana" w:eastAsia="Verdana" w:hAnsi="Verdana"/>
+          <w:noProof/>
+          <w:color w:val="111111"/>
+          <w:sz w:val="22"/>
+          <w:szCs w:val="22"/>
+        </w:rPr>
+        <w:t xml:space="preserve">Phone:</w:t>
+      </w:r>
+      <w:r>
+        <w:rPr>
+          <w:rFonts w:ascii="Verdana" w:cs="Verdana" w:eastAsia="Verdana" w:hAnsi="Verdana"/>
+          <w:noProof/>
+          <w:color w:val="111111"/>
+          <w:sz w:val="22"/>
+          <w:szCs w:val="22"/>
+        </w:rPr>
+        <w:t xml:space="preserve"> </w:t>
+      </w:r>
+      <w:hyperlink w:history="1" r:id="rId8sjjd6-vvzerw1jej95mq">
+        <w:r>
+          <w:rPr>
+            <w:rFonts w:ascii="Verdana" w:cs="Verdana" w:eastAsia="Verdana" w:hAnsi="Verdana"/>
+            <w:noProof/>
+            <w:color w:val="111111"/>
+            <w:sz w:val="22"/>
+            <w:szCs w:val="22"/>
+            <w:u w:val="single" w:color="111111"/>
+          </w:rPr>
+          <w:t xml:space="preserve">+994773183356</w:t>
+        </w:r>
+      </w:hyperlink>
+      <w:r>
+        <w:rPr>
+          <w:rFonts w:ascii="Verdana" w:cs="Verdana" w:eastAsia="Verdana" w:hAnsi="Verdana"/>
+          <w:noProof/>
+          <w:color w:val="111111"/>
+          <w:sz w:val="22"/>
+          <w:szCs w:val="22"/>
+        </w:rPr>
+        <w:t xml:space="preserve">	</w:t>
+      </w:r>
+      <w:r>
+        <w:rPr>
+          <w:rFonts w:ascii="Verdana" w:cs="Verdana" w:eastAsia="Verdana" w:hAnsi="Verdana"/>
+          <w:noProof/>
+          <w:color w:val="111111"/>
+          <w:sz w:val="22"/>
+          <w:szCs w:val="22"/>
+        </w:rPr>
+        <w:t xml:space="preserve">Email:</w:t>
+      </w:r>
+      <w:r>
+        <w:rPr>
+          <w:rFonts w:ascii="Verdana" w:cs="Verdana" w:eastAsia="Verdana" w:hAnsi="Verdana"/>
+          <w:noProof/>
+          <w:color w:val="111111"/>
+          <w:sz w:val="22"/>
+          <w:szCs w:val="22"/>
+        </w:rPr>
+        <w:t xml:space="preserve"> </w:t>
+      </w:r>
+      <w:hyperlink w:history="1" r:id="rIdjo4t-zlurwpethmjc1e3h">
+        <w:r>
+          <w:rPr>
+            <w:rFonts w:ascii="Verdana" w:cs="Verdana" w:eastAsia="Verdana" w:hAnsi="Verdana"/>
+            <w:noProof/>
+            <w:color w:val="111111"/>
+            <w:sz w:val="22"/>
+            <w:szCs w:val="22"/>
+            <w:u w:val="single" w:color="111111"/>
+          </w:rPr>
+          <w:t xml:space="preserve">bayramliialii@gmail.com</w:t>
+        </w:r>
+      </w:hyperlink>
+    </w:p>
+    <w:p>
+      <w:pPr>
+        <w:tabs>
+          <w:tab w:val="left" w:pos="3748"/>
+          <w:tab w:val="left" w:pos="7496"/>
+        </w:tabs>
+        <w:spacing w:after="10" w:line="220"/>
+        <w:rPr>
+          <w:rFonts w:ascii="Verdana" w:cs="Verdana" w:eastAsia="Verdana" w:hAnsi="Verdana"/>
+          <w:color w:val="111111"/>
+          <w:sz w:val="22"/>
+          <w:szCs w:val="22"/>
+        </w:rPr>
+      </w:pPr>
+      <w:hyperlink w:history="1" r:id="rId0cinucptr5qpf-aq8cjzq">
+        <w:r>
+          <w:rPr>
+            <w:rFonts w:ascii="Verdana" w:cs="Verdana" w:eastAsia="Verdana" w:hAnsi="Verdana"/>
+            <w:noProof/>
+            <w:color w:val="111111"/>
+            <w:sz w:val="22"/>
+            <w:szCs w:val="22"/>
+            <w:u w:val="single" w:color="111111"/>
+          </w:rPr>
+          <w:t xml:space="preserve">alibayramli.github.io/me</w:t>
+        </w:r>
+      </w:hyperlink>
+      <w:r>
+        <w:rPr>
+          <w:rFonts w:ascii="Verdana" w:cs="Verdana" w:eastAsia="Verdana" w:hAnsi="Verdana"/>
+          <w:noProof/>
+          <w:color w:val="111111"/>
+          <w:sz w:val="22"/>
+          <w:szCs w:val="22"/>
+        </w:rPr>
+        <w:t xml:space="preserve">	</w:t>
+      </w:r>
+      <w:hyperlink w:history="1" r:id="rIdl5p61otoibx186dd7a1kg">
+        <w:r>
+          <w:rPr>
+            <w:rFonts w:ascii="Verdana" w:cs="Verdana" w:eastAsia="Verdana" w:hAnsi="Verdana"/>
+            <w:noProof/>
+            <w:color w:val="111111"/>
+            <w:sz w:val="22"/>
+            <w:szCs w:val="22"/>
+            <w:u w:val="single" w:color="111111"/>
+          </w:rPr>
+          <w:t xml:space="preserve">github.com/alibayramli</w:t>
+        </w:r>
+      </w:hyperlink>
+      <w:r>
+        <w:rPr>
+          <w:rFonts w:ascii="Verdana" w:cs="Verdana" w:eastAsia="Verdana" w:hAnsi="Verdana"/>
+          <w:noProof/>
+          <w:color w:val="111111"/>
+          <w:sz w:val="22"/>
+          <w:szCs w:val="22"/>
+        </w:rPr>
+        <w:t xml:space="preserve">	</w:t>
+      </w:r>
+      <w:hyperlink w:history="1" r:id="rId455tzhqrgzj1cdxsyolyk">
+        <w:r>
+          <w:rPr>
+            <w:rFonts w:ascii="Verdana" w:cs="Verdana" w:eastAsia="Verdana" w:hAnsi="Verdana"/>
+            <w:noProof/>
+            <w:color w:val="111111"/>
+            <w:sz w:val="22"/>
+            <w:szCs w:val="22"/>
+            <w:u w:val="single" w:color="111111"/>
+          </w:rPr>
+          <w:t xml:space="preserve">linkedin.com/in/alibayramli</w:t>
+        </w:r>
+      </w:hyperlink>
+    </w:p>
     <w:p>
       <w:pPr>
         <w:spacing w:after="90" w:before="145" w:line="220"/>
@@ -387,7 +248,7 @@
           <w:sz w:val="22"/>
           <w:szCs w:val="22"/>
         </w:rPr>
-        <w:t xml:space="preserve">Senior Software Engineer with 8+ years in the field and a strong focus on full-stack development, building web applications and developer-focused solutions. Skilled in internal developer platforms, automation, and improving DevEx.</w:t>
+        <w:t xml:space="preserve">Senior Software Engineer with 8+ years building web applications, including trading interfaces built with Angular and internal developer platforms built on Backstage. I design reusable components and automate provisioning, configuration, and access management.</w:t>
       </w:r>
     </w:p>
     <w:p>
@@ -636,7 +497,7 @@
           <w:sz w:val="22"/>
           <w:szCs w:val="22"/>
         </w:rPr>
-        <w:t xml:space="preserve">Design and maintain Backstage.io software templates that automate provisioning, configuration, and access management, saving ~3,000 engineering hours monthly.</w:t>
+        <w:t xml:space="preserve">Design Backstage templates with shared provisioning, configuration, and access automation, reducing duplication and saving ~3,000 engineering hours monthly.</w:t>
       </w:r>
     </w:p>
     <w:p>
@@ -663,7 +524,7 @@
           <w:sz w:val="22"/>
           <w:szCs w:val="22"/>
         </w:rPr>
-        <w:t xml:space="preserve">Lead golden paths, scorecards, and catalog workflows for a Backstage.io IDP within an engineering organization of 1,000+ developers.</w:t>
+        <w:t xml:space="preserve">Lead development of golden paths, scorecards, and service catalog workflows for a Backstage internal developer platform (IDP) in an organization of 1,000+ developers.</w:t>
       </w:r>
     </w:p>
     <w:p>
@@ -690,7 +551,7 @@
           <w:sz w:val="22"/>
           <w:szCs w:val="22"/>
         </w:rPr>
-        <w:t xml:space="preserve">Mentor and onboard new team members, helping them become productive across the codebase and tooling.</w:t>
+        <w:t xml:space="preserve">Build Backstage plugins that use the Azure AI SDK to validate service catalog metadata.</w:t>
       </w:r>
     </w:p>
     <w:p>
@@ -717,7 +578,7 @@
           <w:sz w:val="22"/>
           <w:szCs w:val="22"/>
         </w:rPr>
-        <w:t xml:space="preserve">Build custom Backstage plugins with the Azure AI SDK to validate catalog metadata.</w:t>
+        <w:t xml:space="preserve">Mentor new team members on the codebase and development tools.</w:t>
       </w:r>
     </w:p>
     <w:p>
@@ -751,7 +612,7 @@
           <w:sz w:val="21"/>
           <w:szCs w:val="21"/>
         </w:rPr>
-        <w:t xml:space="preserve"> Backstage.io, TypeScript, React, Node.js, Python, PostgreSQL, Azure AI SDK, EKS, Helm, Terraform, Argo CD, GitLab CI/CD</w:t>
+        <w:t xml:space="preserve"> Backstage.io, TypeScript, React, Node.js, Python, PostgreSQL, Azure AI SDK, Amazon EKS (AWS), Helm, Terraform, Argo CD, GitLab CI/CD</w:t>
       </w:r>
     </w:p>
     <w:p>
@@ -816,7 +677,7 @@
           <w:sz w:val="22"/>
           <w:szCs w:val="22"/>
         </w:rPr>
-        <w:t xml:space="preserve">Contributed to Angular architecture for Trading.com’s multi-region launch across Europe and Australia; built high-throughput UI kits for a leading forex broker.</w:t>
+        <w:t xml:space="preserve">Contributed to the Angular architecture and built reusable UI components for Trading.com’s launch in Europe and Australia.</w:t>
       </w:r>
     </w:p>
     <w:p>
@@ -843,7 +704,7 @@
           <w:sz w:val="22"/>
           <w:szCs w:val="22"/>
         </w:rPr>
-        <w:t xml:space="preserve">Defined reusable Angular component APIs and integration guidelines, helping developers build consistent interfaces across trading applications.</w:t>
+        <w:t xml:space="preserve">Defined Angular component APIs that kept trading rules in each application, allowing teams to reuse components across products.</w:t>
       </w:r>
     </w:p>
     <w:p>
@@ -966,7 +827,7 @@
           <w:sz w:val="22"/>
           <w:szCs w:val="22"/>
         </w:rPr>
-        <w:t xml:space="preserve">Implemented responsive data grids and real-time UI updates with Angular and AG Grid.</w:t>
+        <w:t xml:space="preserve">Helped migrate 15+ wealth management applications from desktop to web, keeping existing backend APIs to support an incremental rollout.</w:t>
       </w:r>
     </w:p>
     <w:p>
@@ -993,7 +854,7 @@
           <w:sz w:val="22"/>
           <w:szCs w:val="22"/>
         </w:rPr>
-        <w:t xml:space="preserve">Contributed to migrating 15+ legacy desktop apps to modern web applications, eliminating broker-side installation and delivering firm clients a modern wealth management experience.</w:t>
+        <w:t xml:space="preserve">Implemented responsive data grids and real-time UI updates with Angular and AG Grid.</w:t>
       </w:r>
     </w:p>
     <w:p>
@@ -1116,7 +977,7 @@
           <w:sz w:val="22"/>
           <w:szCs w:val="22"/>
         </w:rPr>
-        <w:t xml:space="preserve">Built a gamified employee engagement dashboard with Vue.js and Node.js.</w:t>
+        <w:t xml:space="preserve">Helped move email generation and styling to an internal web platform, reducing annual third-party tooling costs by ~$100K.</w:t>
       </w:r>
     </w:p>
     <w:p>
@@ -1143,7 +1004,7 @@
           <w:sz w:val="22"/>
           <w:szCs w:val="22"/>
         </w:rPr>
-        <w:t xml:space="preserve">Helped reduce ~$100K in annual third-party tooling costs by moving email generation and styling to an internally maintained web platform.</w:t>
+        <w:t xml:space="preserve">Built a gamified employee engagement dashboard with Vue.js and Node.js.</w:t>
       </w:r>
     </w:p>
     <w:p>
@@ -1271,7 +1132,7 @@
         </w:rPr>
         <w:t xml:space="preserve">GitHub: </w:t>
       </w:r>
-      <w:hyperlink w:history="1" r:id="rIddb4ojq3rqirxepoj-jjp3">
+      <w:hyperlink w:history="1" r:id="rIdp2hd23pkj-lu0az-hk6iz">
         <w:r>
           <w:rPr>
             <w:rFonts w:ascii="Verdana" w:cs="Verdana" w:eastAsia="Verdana" w:hAnsi="Verdana"/>
@@ -1389,10 +1250,6 @@
 </w:document>
 </file>
 
-<file path=word/comments.xml><?xml version="1.0" encoding="utf-8"?>
-<w:comments xmlns:cx="http://schemas.microsoft.com/office/drawing/2014/chartex" xmlns:cx1="http://schemas.microsoft.com/office/drawing/2015/9/8/chartex" xmlns:cx2="http://schemas.microsoft.com/office/drawing/2015/10/21/chartex" xmlns:cx3="http://schemas.microsoft.com/office/drawing/2016/5/9/chartex" xmlns:cx4="http://schemas.microsoft.com/office/drawing/2016/5/10/chartex" xmlns:cx5="http://schemas.microsoft.com/office/drawing/2016/5/11/chartex" xmlns:cx6="http://schemas.microsoft.com/office/drawing/2016/5/12/chartex" xmlns:cx7="http://schemas.microsoft.com/office/drawing/2016/5/13/chartex" xmlns:cx8="http://schemas.microsoft.com/office/drawing/2016/5/14/chartex" xmlns:mc="http://schemas.openxmlformats.org/markup-compatibility/2006" xmlns:aink="http://schemas.microsoft.com/office/drawing/2016/ink" xmlns:am3d="http://schemas.microsoft.com/office/drawing/2017/model3d" xmlns:o="urn:schemas-microsoft-com:office:office" xmlns:r="http://schemas.openxmlformats.org/officeDocument/2006/relationships" xmlns:m="http://schemas.openxmlformats.org/officeDocument/2006/math" xmlns:v="urn:schemas-microsoft-com:vml" xmlns:wp14="http://schemas.microsoft.com/office/word/2010/wordprocessingDrawing" xmlns:wp="http://schemas.openxmlformats.org/drawingml/2006/wordprocessingDrawing" xmlns:w10="urn:schemas-microsoft-com:office:word" xmlns:w="http://schemas.openxmlformats.org/wordprocessingml/2006/main" xmlns:w14="http://schemas.microsoft.com/office/word/2010/wordml" xmlns:w15="http://schemas.microsoft.com/office/word/2012/wordml" xmlns:w16cex="http://schemas.microsoft.com/office/word/2018/wordml/cex" xmlns:w16cid="http://schemas.microsoft.com/office/word/2016/wordml/cid" xmlns:w16="http://schemas.microsoft.com/office/word/2018/wordml" xmlns:w16sdtdh="http://schemas.microsoft.com/office/word/2020/wordml/sdtdatahash" xmlns:w16se="http://schemas.microsoft.com/office/word/2015/wordml/symex" xmlns:wpg="http://schemas.microsoft.com/office/word/2010/wordprocessingGroup" xmlns:wpi="http://schemas.microsoft.com/office/word/2010/wordprocessingInk" xmlns:wne="http://schemas.microsoft.com/office/word/2006/wordml" xmlns:wps="http://schemas.microsoft.com/office/word/2010/wordprocessingShape"/>
-</file>
-
 <file path=word/endnotes.xml><?xml version="1.0" encoding="utf-8"?>
 <w:endnotes xmlns:wpc="http://schemas.microsoft.com/office/word/2010/wordprocessingCanvas" xmlns:mc="http://schemas.openxmlformats.org/markup-compatibility/2006" xmlns:o="urn:schemas-microsoft-com:office:office" xmlns:r="http://schemas.openxmlformats.org/officeDocument/2006/relationships" xmlns:m="http://schemas.openxmlformats.org/officeDocument/2006/math" xmlns:v="urn:schemas-microsoft-com:vml" xmlns:wp14="http://schemas.microsoft.com/office/word/2010/wordprocessingDrawing" xmlns:wp="http://schemas.openxmlformats.org/drawingml/2006/wordprocessingDrawing" xmlns:w10="urn:schemas-microsoft-com:office:word" xmlns:w="http://schemas.openxmlformats.org/wordprocessingml/2006/main" xmlns:w14="http://schemas.microsoft.com/office/word/2010/wordml" xmlns:w15="http://schemas.microsoft.com/office/word/2012/wordml" xmlns:wpg="http://schemas.microsoft.com/office/word/2010/wordprocessingGroup" xmlns:wpi="http://schemas.microsoft.com/office/word/2010/wordprocessingInk" xmlns:wne="http://schemas.microsoft.com/office/word/2006/wordml" xmlns:wps="http://schemas.microsoft.com/office/word/2010/wordprocessingShape" mc:Ignorable="w14 w15 wp14">
   <w:endnote w:type="separator" w:id="-1">
@@ -1471,7 +1328,7 @@
 <w:numbering xmlns:wpc="http://schemas.microsoft.com/office/word/2010/wordprocessingCanvas" xmlns:mc="http://schemas.openxmlformats.org/markup-compatibility/2006" xmlns:o="urn:schemas-microsoft-com:office:office" xmlns:r="http://schemas.openxmlformats.org/officeDocument/2006/relationships" xmlns:m="http://schemas.openxmlformats.org/officeDocument/2006/math" xmlns:v="urn:schemas-microsoft-com:vml" xmlns:wp14="http://schemas.microsoft.com/office/word/2010/wordprocessingDrawing" xmlns:wp="http://schemas.openxmlformats.org/drawingml/2006/wordprocessingDrawing" xmlns:w10="urn:schemas-microsoft-com:office:word" xmlns:w="http://schemas.openxmlformats.org/wordprocessingml/2006/main" xmlns:w14="http://schemas.microsoft.com/office/word/2010/wordml" xmlns:w15="http://schemas.microsoft.com/office/word/2012/wordml" xmlns:wpg="http://schemas.microsoft.com/office/word/2010/wordprocessingGroup" xmlns:wpi="http://schemas.microsoft.com/office/word/2010/wordprocessingInk" xmlns:wne="http://schemas.microsoft.com/office/word/2006/wordml" xmlns:wps="http://schemas.microsoft.com/office/word/2010/wordprocessingShape" mc:Ignorable="w14 w15 wp14">
   <w:abstractNum w:abstractNumId="1" w15:restartNumberingAfterBreak="0">
     <w:multiLevelType w:val="hybridMultilevel"/>
-    <w:lvl w:ilvl="0" w15:tentative="1">
+    <w:lvl w:ilvl="0" w:tentative="1">
       <w:start w:val="1"/>
       <w:numFmt w:val="bullet"/>
       <w:lvlText w:val="●"/>
@@ -1480,7 +1337,7 @@
         <w:ind w:left="720" w:hanging="360"/>
       </w:pPr>
     </w:lvl>
-    <w:lvl w:ilvl="1" w15:tentative="1">
+    <w:lvl w:ilvl="1" w:tentative="1">
       <w:start w:val="1"/>
       <w:numFmt w:val="bullet"/>
       <w:lvlText w:val="○"/>
@@ -1489,7 +1346,7 @@
         <w:ind w:left="1440" w:hanging="360"/>
       </w:pPr>
     </w:lvl>
-    <w:lvl w:ilvl="2" w15:tentative="1">
+    <w:lvl w:ilvl="2" w:tentative="1">
       <w:start w:val="1"/>
       <w:numFmt w:val="bullet"/>
       <w:lvlText w:val="■"/>
@@ -1498,7 +1355,7 @@
         <w:ind w:left="2160" w:hanging="360"/>
       </w:pPr>
     </w:lvl>
-    <w:lvl w:ilvl="3" w15:tentative="1">
+    <w:lvl w:ilvl="3" w:tentative="1">
       <w:start w:val="1"/>
       <w:numFmt w:val="bullet"/>
       <w:lvlText w:val="●"/>
@@ -1507,7 +1364,7 @@
         <w:ind w:left="2880" w:hanging="360"/>
       </w:pPr>
     </w:lvl>
-    <w:lvl w:ilvl="4" w15:tentative="1">
+    <w:lvl w:ilvl="4" w:tentative="1">
       <w:start w:val="1"/>
       <w:numFmt w:val="bullet"/>
       <w:lvlText w:val="○"/>
@@ -1516,7 +1373,7 @@
         <w:ind w:left="3600" w:hanging="360"/>
       </w:pPr>
     </w:lvl>
-    <w:lvl w:ilvl="5" w15:tentative="1">
+    <w:lvl w:ilvl="5" w:tentative="1">
       <w:start w:val="1"/>
       <w:numFmt w:val="bullet"/>
       <w:lvlText w:val="■"/>
@@ -1525,7 +1382,7 @@
         <w:ind w:left="4320" w:hanging="360"/>
       </w:pPr>
     </w:lvl>
-    <w:lvl w:ilvl="6" w15:tentative="1">
+    <w:lvl w:ilvl="6" w:tentative="1">
       <w:start w:val="1"/>
       <w:numFmt w:val="bullet"/>
       <w:lvlText w:val="●"/>
@@ -1534,7 +1391,7 @@
         <w:ind w:left="5040" w:hanging="360"/>
       </w:pPr>
     </w:lvl>
-    <w:lvl w:ilvl="7" w15:tentative="1">
+    <w:lvl w:ilvl="7" w:tentative="1">
       <w:start w:val="1"/>
       <w:numFmt w:val="bullet"/>
       <w:lvlText w:val="●"/>
@@ -1543,7 +1400,7 @@
         <w:ind w:left="5760" w:hanging="360"/>
       </w:pPr>
     </w:lvl>
-    <w:lvl w:ilvl="8" w15:tentative="1">
+    <w:lvl w:ilvl="8" w:tentative="1">
       <w:start w:val="1"/>
       <w:numFmt w:val="bullet"/>
       <w:lvlText w:val="●"/>
@@ -1568,6 +1425,25 @@
     <w:rPrDefault/>
     <w:pPrDefault/>
   </w:docDefaults>
+  <w:style w:type="paragraph" w:styleId="Normal" w:default="1">
+    <w:name w:val="Normal"/>
+    <w:qFormat/>
+  </w:style>
+  <w:style w:type="table" w:styleId="TableNormal" w:default="true">
+    <w:name w:val="Normal Table"/>
+    <w:uiPriority w:val="99"/>
+    <w:semiHidden/>
+    <w:unhideWhenUsed/>
+    <w:tblPr>
+      <w:tblInd w:type="dxa" w:w="0"/>
+      <w:tblCellMar>
+        <w:top w:type="dxa" w:w="0"/>
+        <w:left w:type="dxa" w:w="108"/>
+        <w:bottom w:type="dxa" w:w="0"/>
+        <w:right w:type="dxa" w:w="108"/>
+      </w:tblCellMar>
+    </w:tblPr>
+  </w:style>
   <w:style w:type="paragraph" w:styleId="Title">
     <w:name w:val="Title"/>
     <w:basedOn w:val="Normal"/>
@@ -1740,4 +1616,294 @@
     </w:rPr>
   </w:style>
 </w:styles>
+</file>
+
+<file path=word/theme/theme1.xml><?xml version="1.0" encoding="utf-8"?>
+<a:theme xmlns:a="http://schemas.openxmlformats.org/drawingml/2006/main" name="Office Theme">
+  <a:themeElements>
+    <a:clrScheme name="Office">
+      <a:dk1>
+        <a:sysClr val="windowText" lastClr="000000"/>
+      </a:dk1>
+      <a:lt1>
+        <a:sysClr val="window" lastClr="FFFFFF"/>
+      </a:lt1>
+      <a:dk2>
+        <a:srgbClr val="44546A"/>
+      </a:dk2>
+      <a:lt2>
+        <a:srgbClr val="E7E6E6"/>
+      </a:lt2>
+      <a:accent1>
+        <a:srgbClr val="4472C4"/>
+      </a:accent1>
+      <a:accent2>
+        <a:srgbClr val="ED7D31"/>
+      </a:accent2>
+      <a:accent3>
+        <a:srgbClr val="A5A5A5"/>
+      </a:accent3>
+      <a:accent4>
+        <a:srgbClr val="FFC000"/>
+      </a:accent4>
+      <a:accent5>
+        <a:srgbClr val="5B9BD5"/>
+      </a:accent5>
+      <a:accent6>
+        <a:srgbClr val="70AD47"/>
+      </a:accent6>
+      <a:hlink>
+        <a:srgbClr val="0563C1"/>
+      </a:hlink>
+      <a:folHlink>
+        <a:srgbClr val="954F72"/>
+      </a:folHlink>
+    </a:clrScheme>
+    <a:fontScheme name="Office">
+      <a:majorFont>
+        <a:latin typeface="Calibri Light" panose="020F0302020204030204"/>
+        <a:ea typeface=""/>
+        <a:cs typeface=""/>
+        <a:font script="Jpan" typeface="游ゴシック Light"/>
+        <a:font script="Hang" typeface="맑은 고딕"/>
+        <a:font script="Hans" typeface="等线 Light"/>
+        <a:font script="Hant" typeface="新細明體"/>
+        <a:font script="Arab" typeface="Times New Roman"/>
+        <a:font script="Hebr" typeface="Times New Roman"/>
+        <a:font script="Thai" typeface="Angsana New"/>
+        <a:font script="Ethi" typeface="Nyala"/>
+        <a:font script="Beng" typeface="Vrinda"/>
+        <a:font script="Gujr" typeface="Shruti"/>
+        <a:font script="Khmr" typeface="MoolBoran"/>
+        <a:font script="Knda" typeface="Tunga"/>
+        <a:font script="Guru" typeface="Raavi"/>
+        <a:font script="Cans" typeface="Euphemia"/>
+        <a:font script="Cher" typeface="Plantagenet Cherokee"/>
+        <a:font script="Yiii" typeface="Microsoft Yi Baiti"/>
+        <a:font script="Tibt" typeface="Microsoft Himalaya"/>
+        <a:font script="Thaa" typeface="MV Boli"/>
+        <a:font script="Deva" typeface="Mangal"/>
+        <a:font script="Telu" typeface="Gautami"/>
+        <a:font script="Taml" typeface="Latha"/>
+        <a:font script="Syrc" typeface="Estrangelo Edessa"/>
+        <a:font script="Orya" typeface="Kalinga"/>
+        <a:font script="Mlym" typeface="Kartika"/>
+        <a:font script="Laoo" typeface="DokChampa"/>
+        <a:font script="Sinh" typeface="Iskoola Pota"/>
+        <a:font script="Mong" typeface="Mongolian Baiti"/>
+        <a:font script="Viet" typeface="Times New Roman"/>
+        <a:font script="Uigh" typeface="Microsoft Uighur"/>
+        <a:font script="Geor" typeface="Sylfaen"/>
+        <a:font script="Armn" typeface="Arial"/>
+        <a:font script="Bugi" typeface="Leelawadee UI"/>
+        <a:font script="Bopo" typeface="Microsoft JhengHei"/>
+        <a:font script="Java" typeface="Javanese Text"/>
+        <a:font script="Lisu" typeface="Segoe UI"/>
+        <a:font script="Mymr" typeface="Myanmar Text"/>
+        <a:font script="Nkoo" typeface="Ebrima"/>
+        <a:font script="Olck" typeface="Nirmala UI"/>
+        <a:font script="Osma" typeface="Ebrima"/>
+        <a:font script="Phag" typeface="Phagspa"/>
+        <a:font script="Syrn" typeface="Estrangelo Edessa"/>
+        <a:font script="Syrj" typeface="Estrangelo Edessa"/>
+        <a:font script="Syre" typeface="Estrangelo Edessa"/>
+        <a:font script="Sora" typeface="Nirmala UI"/>
+        <a:font script="Tale" typeface="Microsoft Tai Le"/>
+        <a:font script="Talu" typeface="Microsoft New Tai Lue"/>
+        <a:font script="Tfng" typeface="Ebrima"/>
+      </a:majorFont>
+      <a:minorFont>
+        <a:latin typeface="Calibri" panose="020F0502020204030204"/>
+        <a:ea typeface=""/>
+        <a:cs typeface=""/>
+        <a:font script="Jpan" typeface="游明朝"/>
+        <a:font script="Hang" typeface="맑은 고딕"/>
+        <a:font script="Hans" typeface="等线"/>
+        <a:font script="Hant" typeface="新細明體"/>
+        <a:font script="Arab" typeface="Arial"/>
+        <a:font script="Hebr" typeface="Arial"/>
+        <a:font script="Thai" typeface="Cordia New"/>
+        <a:font script="Ethi" typeface="Nyala"/>
+        <a:font script="Beng" typeface="Vrinda"/>
+        <a:font script="Gujr" typeface="Shruti"/>
+        <a:font script="Khmr" typeface="DaunPenh"/>
+        <a:font script="Knda" typeface="Tunga"/>
+        <a:font script="Guru" typeface="Raavi"/>
+        <a:font script="Cans" typeface="Euphemia"/>
+        <a:font script="Cher" typeface="Plantagenet Cherokee"/>
+        <a:font script="Yiii" typeface="Microsoft Yi Baiti"/>
+        <a:font script="Tibt" typeface="Microsoft Himalaya"/>
+        <a:font script="Thaa" typeface="MV Boli"/>
+        <a:font script="Deva" typeface="Mangal"/>
+        <a:font script="Telu" typeface="Gautami"/>
+        <a:font script="Taml" typeface="Latha"/>
+        <a:font script="Syrc" typeface="Estrangelo Edessa"/>
+        <a:font script="Orya" typeface="Kalinga"/>
+        <a:font script="Mlym" typeface="Kartika"/>
+        <a:font script="Laoo" typeface="DokChampa"/>
+        <a:font script="Sinh" typeface="Iskoola Pota"/>
+        <a:font script="Mong" typeface="Mongolian Baiti"/>
+        <a:font script="Viet" typeface="Arial"/>
+        <a:font script="Uigh" typeface="Microsoft Uighur"/>
+        <a:font script="Geor" typeface="Sylfaen"/>
+        <a:font script="Armn" typeface="Arial"/>
+        <a:font script="Bugi" typeface="Leelawadee UI"/>
+        <a:font script="Bopo" typeface="Microsoft JhengHei"/>
+        <a:font script="Java" typeface="Javanese Text"/>
+        <a:font script="Lisu" typeface="Segoe UI"/>
+        <a:font script="Mymr" typeface="Myanmar Text"/>
+        <a:font script="Nkoo" typeface="Ebrima"/>
+        <a:font script="Olck" typeface="Nirmala UI"/>
+        <a:font script="Osma" typeface="Ebrima"/>
+        <a:font script="Phag" typeface="Phagspa"/>
+        <a:font script="Syrn" typeface="Estrangelo Edessa"/>
+        <a:font script="Syrj" typeface="Estrangelo Edessa"/>
+        <a:font script="Syre" typeface="Estrangelo Edessa"/>
+        <a:font script="Sora" typeface="Nirmala UI"/>
+        <a:font script="Tale" typeface="Microsoft Tai Le"/>
+        <a:font script="Talu" typeface="Microsoft New Tai Lue"/>
+        <a:font script="Tfng" typeface="Ebrima"/>
+      </a:minorFont>
+    </a:fontScheme>
+    <a:fmtScheme name="Office">
+      <a:fillStyleLst>
+        <a:solidFill>
+          <a:schemeClr val="phClr"/>
+        </a:solidFill>
+        <a:gradFill rotWithShape="true">
+          <a:gsLst>
+            <a:gs pos="0">
+              <a:schemeClr val="phClr">
+                <a:lumMod val="110000"/>
+                <a:satMod val="105000"/>
+                <a:tint val="67000"/>
+              </a:schemeClr>
+            </a:gs>
+            <a:gs pos="50000">
+              <a:schemeClr val="phClr">
+                <a:lumMod val="105000"/>
+                <a:satMod val="103000"/>
+                <a:tint val="73000"/>
+              </a:schemeClr>
+            </a:gs>
+            <a:gs pos="100000">
+              <a:schemeClr val="phClr">
+                <a:lumMod val="105000"/>
+                <a:satMod val="109000"/>
+                <a:tint val="81000"/>
+              </a:schemeClr>
+            </a:gs>
+          </a:gsLst>
+          <a:lin ang="5400000" scaled="false"/>
+        </a:gradFill>
+        <a:gradFill rotWithShape="true">
+          <a:gsLst>
+            <a:gs pos="0">
+              <a:schemeClr val="phClr">
+                <a:satMod val="103000"/>
+                <a:lumMod val="102000"/>
+                <a:tint val="94000"/>
+              </a:schemeClr>
+            </a:gs>
+            <a:gs pos="50000">
+              <a:schemeClr val="phClr">
+                <a:satMod val="110000"/>
+                <a:lumMod val="100000"/>
+                <a:shade val="100000"/>
+              </a:schemeClr>
+            </a:gs>
+            <a:gs pos="100000">
+              <a:schemeClr val="phClr">
+                <a:lumMod val="99000"/>
+                <a:satMod val="120000"/>
+                <a:shade val="78000"/>
+              </a:schemeClr>
+            </a:gs>
+          </a:gsLst>
+          <a:lin ang="5400000" scaled="false"/>
+        </a:gradFill>
+      </a:fillStyleLst>
+      <a:lnStyleLst>
+        <a:ln w="6350" cap="flat" cmpd="sng" algn="ctr">
+          <a:solidFill>
+            <a:schemeClr val="phClr"/>
+          </a:solidFill>
+          <a:prstDash val="solid"/>
+          <a:miter lim="800000"/>
+        </a:ln>
+        <a:ln w="12700" cap="flat" cmpd="sng" algn="ctr">
+          <a:solidFill>
+            <a:schemeClr val="phClr"/>
+          </a:solidFill>
+          <a:prstDash val="solid"/>
+          <a:miter lim="800000"/>
+        </a:ln>
+        <a:ln w="19050" cap="flat" cmpd="sng" algn="ctr">
+          <a:solidFill>
+            <a:schemeClr val="phClr"/>
+          </a:solidFill>
+          <a:prstDash val="solid"/>
+          <a:miter lim="800000"/>
+        </a:ln>
+      </a:lnStyleLst>
+      <a:effectStyleLst>
+        <a:effectStyle>
+          <a:effectLst/>
+        </a:effectStyle>
+        <a:effectStyle>
+          <a:effectLst/>
+        </a:effectStyle>
+        <a:effectStyle>
+          <a:effectLst>
+            <a:outerShdw blurRad="57150" dist="19050" dir="5400000" algn="ctr" rotWithShape="false">
+              <a:srgbClr val="000000">
+                <a:alpha val="63000"/>
+              </a:srgbClr>
+            </a:outerShdw>
+          </a:effectLst>
+        </a:effectStyle>
+      </a:effectStyleLst>
+      <a:bgFillStyleLst>
+        <a:solidFill>
+          <a:schemeClr val="phClr"/>
+        </a:solidFill>
+        <a:solidFill>
+          <a:schemeClr val="phClr">
+            <a:tint val="95000"/>
+            <a:satMod val="170000"/>
+          </a:schemeClr>
+        </a:solidFill>
+        <a:gradFill rotWithShape="true">
+          <a:gsLst>
+            <a:gs pos="0">
+              <a:schemeClr val="phClr">
+                <a:tint val="93000"/>
+                <a:satMod val="150000"/>
+                <a:shade val="98000"/>
+                <a:lumMod val="102000"/>
+              </a:schemeClr>
+            </a:gs>
+            <a:gs pos="50000">
+              <a:schemeClr val="phClr">
+                <a:tint val="98000"/>
+                <a:satMod val="130000"/>
+                <a:shade val="90000"/>
+                <a:lumMod val="103000"/>
+              </a:schemeClr>
+            </a:gs>
+            <a:gs pos="100000">
+              <a:schemeClr val="phClr">
+                <a:shade val="63000"/>
+                <a:satMod val="120000"/>
+              </a:schemeClr>
+            </a:gs>
+          </a:gsLst>
+          <a:lin ang="5400000" scaled="false"/>
+        </a:gradFill>
+      </a:bgFillStyleLst>
+    </a:fmtScheme>
+  </a:themeElements>
+  <a:objectDefaults/>
+  <a:extraClrSchemeLst/>
+</a:theme>
 </file>
</xml_diff>

<commit_message>
chore: update wording for skills
</commit_message>
<xml_diff>
--- a/public/resume/Ali_Bayramli_Resume.docx
+++ b/public/resume/Ali_Bayramli_Resume.docx
@@ -99,7 +99,7 @@
         </w:rPr>
         <w:t xml:space="preserve"> </w:t>
       </w:r>
-      <w:hyperlink w:history="1" r:id="rId8sjjd6-vvzerw1jej95mq">
+      <w:hyperlink w:history="1" r:id="rIda3edh1_jz21uh7us3b-yi">
         <w:r>
           <w:rPr>
             <w:rFonts w:ascii="Verdana" w:cs="Verdana" w:eastAsia="Verdana" w:hAnsi="Verdana"/>
@@ -142,7 +142,7 @@
         </w:rPr>
         <w:t xml:space="preserve"> </w:t>
       </w:r>
-      <w:hyperlink w:history="1" r:id="rIdjo4t-zlurwpethmjc1e3h">
+      <w:hyperlink w:history="1" r:id="rIdrykks2rzmbnhrrrcxff2a">
         <w:r>
           <w:rPr>
             <w:rFonts w:ascii="Verdana" w:cs="Verdana" w:eastAsia="Verdana" w:hAnsi="Verdana"/>
@@ -170,7 +170,7 @@
           <w:szCs w:val="22"/>
         </w:rPr>
       </w:pPr>
-      <w:hyperlink w:history="1" r:id="rId0cinucptr5qpf-aq8cjzq">
+      <w:hyperlink w:history="1" r:id="rIdpamfyktgohys82f5hnzq1">
         <w:r>
           <w:rPr>
             <w:rFonts w:ascii="Verdana" w:cs="Verdana" w:eastAsia="Verdana" w:hAnsi="Verdana"/>
@@ -193,7 +193,7 @@
         </w:rPr>
         <w:t xml:space="preserve">	</w:t>
       </w:r>
-      <w:hyperlink w:history="1" r:id="rIdl5p61otoibx186dd7a1kg">
+      <w:hyperlink w:history="1" r:id="rIdyay1d4ymwqervvhuhdccr">
         <w:r>
           <w:rPr>
             <w:rFonts w:ascii="Verdana" w:cs="Verdana" w:eastAsia="Verdana" w:hAnsi="Verdana"/>
@@ -216,7 +216,7 @@
         </w:rPr>
         <w:t xml:space="preserve">	</w:t>
       </w:r>
-      <w:hyperlink w:history="1" r:id="rId455tzhqrgzj1cdxsyolyk">
+      <w:hyperlink w:history="1" r:id="rId5tdyf4omjf6na0muhbqd4">
         <w:r>
           <w:rPr>
             <w:rFonts w:ascii="Verdana" w:cs="Verdana" w:eastAsia="Verdana" w:hAnsi="Verdana"/>
@@ -301,7 +301,7 @@
           <w:sz w:val="22"/>
           <w:szCs w:val="22"/>
         </w:rPr>
-        <w:t xml:space="preserve">Frontend: Angular, React, TypeScript, JavaScript, NgRx, RxJS</w:t>
+        <w:t xml:space="preserve">Frontend: Angular, React.js, TypeScript, JavaScript, NgRx, RxJS</w:t>
       </w:r>
     </w:p>
     <w:p>
@@ -612,7 +612,7 @@
           <w:sz w:val="21"/>
           <w:szCs w:val="21"/>
         </w:rPr>
-        <w:t xml:space="preserve"> Backstage.io, TypeScript, React, Node.js, Python, PostgreSQL, Azure AI SDK, Amazon EKS (AWS), Helm, Terraform, Argo CD, GitLab CI/CD</w:t>
+        <w:t xml:space="preserve"> Backstage.io, TypeScript, React.js, Node.js, Python, PostgreSQL, Azure AI SDK, Amazon EKS (AWS), Helm, Terraform, Argo CD, GitLab CI/CD</w:t>
       </w:r>
     </w:p>
     <w:p>
@@ -738,7 +738,7 @@
           <w:sz w:val="21"/>
           <w:szCs w:val="21"/>
         </w:rPr>
-        <w:t xml:space="preserve"> Angular, TypeScript, NgRx, Signals, RxJS, JavaScript, Internationalization (i18n)</w:t>
+        <w:t xml:space="preserve"> Angular, TypeScript, NgRx, Angular Signals, RxJS, JavaScript, Internationalization (i18n)</w:t>
       </w:r>
     </w:p>
     <w:p>
@@ -1109,7 +1109,7 @@
           <w:sz w:val="22"/>
           <w:szCs w:val="22"/>
         </w:rPr>
-        <w:t xml:space="preserve">Built a Backstage plugin with React and Node.js to track software template adoption, success rates, and execution times, with searchable run history and permission-based access.</w:t>
+        <w:t xml:space="preserve">Built a Backstage plugin with React.js and Node.js to track software template adoption, success rates, and execution times, with searchable run history and permission-based access.</w:t>
       </w:r>
       <w:r>
         <w:rPr>
@@ -1132,7 +1132,7 @@
         </w:rPr>
         <w:t xml:space="preserve">GitHub: </w:t>
       </w:r>
-      <w:hyperlink w:history="1" r:id="rIdp2hd23pkj-lu0az-hk6iz">
+      <w:hyperlink w:history="1" r:id="rIdak0xbsmkc1wxlqug_thts">
         <w:r>
           <w:rPr>
             <w:rFonts w:ascii="Verdana" w:cs="Verdana" w:eastAsia="Verdana" w:hAnsi="Verdana"/>

</xml_diff>